<commit_message>
Remove the QR code from the syllabus, web page and handout
The bit.ly short link stays as plain text in each masthead. The build
checks now fail if an inlined QR image or an embedded Word image
reappears, and qr.png is retired (ignored, no longer tracked).

Co-Authored-By: Claude Fable 5.1 <noreply@anthropic.com>
Claude-Session: https://claude.ai/code/session_01JpoJqEHSFuPaXhJeHZ6wHg
</commit_message>
<xml_diff>
--- a/fall-2026/ctec121/CTEC_121_Syllabus_Fall_2026.docx
+++ b/fall-2026/ctec121/CTEC_121_Syllabus_Fall_2026.docx
@@ -155,61 +155,6 @@
     </w:p>
     <w:p>
       <w:pPr>
-        <w:pStyle w:val="CaptionedFigure"/>
-      </w:pPr>
-      <w:r>
-        <w:drawing>
-          <wp:inline>
-            <wp:extent cx="914400" cy="914400"/>
-            <wp:effectExtent b="0" l="0" r="0" t="0"/>
-            <wp:docPr descr="QR code linking to this syllabus at bit.ly/ctec121fall26" title="" id="22" name="Picture"/>
-            <a:graphic>
-              <a:graphicData uri="http://schemas.openxmlformats.org/drawingml/2006/picture">
-                <pic:pic>
-                  <pic:nvPicPr>
-                    <pic:cNvPr descr="qr.png" id="23" name="Picture"/>
-                    <pic:cNvPicPr>
-                      <a:picLocks noChangeArrowheads="1" noChangeAspect="1"/>
-                    </pic:cNvPicPr>
-                  </pic:nvPicPr>
-                  <pic:blipFill>
-                    <a:blip r:embed="rId21"/>
-                    <a:stretch>
-                      <a:fillRect/>
-                    </a:stretch>
-                  </pic:blipFill>
-                  <pic:spPr bwMode="auto">
-                    <a:xfrm>
-                      <a:off x="0" y="0"/>
-                      <a:ext cx="914400" cy="914400"/>
-                    </a:xfrm>
-                    <a:prstGeom prst="rect">
-                      <a:avLst/>
-                    </a:prstGeom>
-                    <a:noFill/>
-                    <a:ln w="9525">
-                      <a:noFill/>
-                      <a:headEnd/>
-                      <a:tailEnd/>
-                    </a:ln>
-                  </pic:spPr>
-                </pic:pic>
-              </a:graphicData>
-            </a:graphic>
-          </wp:inline>
-        </w:drawing>
-      </w:r>
-    </w:p>
-    <w:p>
-      <w:pPr>
-        <w:pStyle w:val="ImageCaption"/>
-      </w:pPr>
-      <w:r>
-        <w:t xml:space="preserve">QR code linking to this syllabus at bit.ly/ctec121fall26</w:t>
-      </w:r>
-    </w:p>
-    <w:p>
-      <w:pPr>
         <w:pStyle w:val="BodyText"/>
       </w:pPr>
       <w:r>
@@ -217,12 +162,12 @@
           <w:bCs/>
           <w:b/>
         </w:rPr>
-        <w:t xml:space="preserve">Scan to open this syllabus:</w:t>
-      </w:r>
-      <w:r>
-        <w:t xml:space="preserve"> </w:t>
-      </w:r>
-      <w:hyperlink r:id="rId24">
+        <w:t xml:space="preserve">This syllabus online:</w:t>
+      </w:r>
+      <w:r>
+        <w:t xml:space="preserve"> </w:t>
+      </w:r>
+      <w:hyperlink r:id="rId21">
         <w:r>
           <w:rPr>
             <w:rStyle w:val="Hyperlink"/>
@@ -238,7 +183,7 @@
         </w:pict>
       </w:r>
     </w:p>
-    <w:bookmarkStart w:id="28" w:name="start-here"/>
+    <w:bookmarkStart w:id="25" w:name="start-here"/>
     <w:p>
       <w:pPr>
         <w:pStyle w:val="Heading1"/>
@@ -544,7 +489,7 @@
             <w:r>
               <w:t xml:space="preserve">The CS50 Duck (</w:t>
             </w:r>
-            <w:hyperlink r:id="rId25">
+            <w:hyperlink r:id="rId22">
               <w:r>
                 <w:rPr>
                   <w:rStyle w:val="Hyperlink"/>
@@ -558,7 +503,7 @@
             <w:r>
               <w:t xml:space="preserve"> </w:t>
             </w:r>
-            <w:hyperlink r:id="rId26">
+            <w:hyperlink r:id="rId23">
               <w:r>
                 <w:rPr>
                   <w:rStyle w:val="Hyperlink"/>
@@ -774,7 +719,7 @@
       <w:r>
         <w:t xml:space="preserve"> </w:t>
       </w:r>
-      <w:hyperlink r:id="rId27">
+      <w:hyperlink r:id="rId24">
         <w:r>
           <w:rPr>
             <w:rStyle w:val="Hyperlink"/>
@@ -864,7 +809,7 @@
         </w:rPr>
         <w:t xml:space="preserve"> </w:t>
       </w:r>
-      <w:hyperlink r:id="rId26">
+      <w:hyperlink r:id="rId23">
         <w:r>
           <w:rPr>
             <w:rStyle w:val="Hyperlink"/>
@@ -921,8 +866,8 @@
         </w:pict>
       </w:r>
     </w:p>
-    <w:bookmarkEnd w:id="28"/>
-    <w:bookmarkStart w:id="30" w:name="the-course-at-a-glance"/>
+    <w:bookmarkEnd w:id="25"/>
+    <w:bookmarkStart w:id="27" w:name="the-course-at-a-glance"/>
     <w:p>
       <w:pPr>
         <w:pStyle w:val="Heading1"/>
@@ -1205,7 +1150,7 @@
               <w:pStyle w:val="Compact"/>
               <w:jc w:val="left"/>
             </w:pPr>
-            <w:hyperlink r:id="rId27">
+            <w:hyperlink r:id="rId24">
               <w:r>
                 <w:rPr>
                   <w:rStyle w:val="Hyperlink"/>
@@ -1351,7 +1296,7 @@
       <w:r>
         <w:t xml:space="preserve"> </w:t>
       </w:r>
-      <w:hyperlink r:id="rId29">
+      <w:hyperlink r:id="rId26">
         <w:r>
           <w:rPr>
             <w:rStyle w:val="Hyperlink"/>
@@ -1394,8 +1339,8 @@
         </w:pict>
       </w:r>
     </w:p>
-    <w:bookmarkEnd w:id="30"/>
-    <w:bookmarkStart w:id="32" w:name="meet-your-instructor"/>
+    <w:bookmarkEnd w:id="27"/>
+    <w:bookmarkStart w:id="29" w:name="meet-your-instructor"/>
     <w:p>
       <w:pPr>
         <w:pStyle w:val="Heading1"/>
@@ -1675,7 +1620,7 @@
         <w:t xml:space="preserve">Something went astray. You are not bothering me.</w:t>
       </w:r>
     </w:p>
-    <w:bookmarkStart w:id="31" w:name="what-i-believe-about-teaching"/>
+    <w:bookmarkStart w:id="28" w:name="what-i-believe-about-teaching"/>
     <w:p>
       <w:pPr>
         <w:pStyle w:val="Heading2"/>
@@ -1821,9 +1766,9 @@
         </w:pict>
       </w:r>
     </w:p>
-    <w:bookmarkEnd w:id="31"/>
-    <w:bookmarkEnd w:id="32"/>
-    <w:bookmarkStart w:id="38" w:name="what-this-class-is-like"/>
+    <w:bookmarkEnd w:id="28"/>
+    <w:bookmarkEnd w:id="29"/>
+    <w:bookmarkStart w:id="35" w:name="what-this-class-is-like"/>
     <w:p>
       <w:pPr>
         <w:pStyle w:val="Heading1"/>
@@ -1832,7 +1777,7 @@
         <w:t xml:space="preserve">What this class is like</w:t>
       </w:r>
     </w:p>
-    <w:bookmarkStart w:id="33" w:name="why-python"/>
+    <w:bookmarkStart w:id="30" w:name="why-python"/>
     <w:p>
       <w:pPr>
         <w:pStyle w:val="Heading2"/>
@@ -1899,8 +1844,8 @@
         <w:t xml:space="preserve">on your screen can be intimidating at first. That fades faster than you’d think. Coding is really just solving problems in small, careful steps, and that’s a skill you already have.</w:t>
       </w:r>
     </w:p>
-    <w:bookmarkEnd w:id="33"/>
-    <w:bookmarkStart w:id="34" w:name="how-we-spend-our-time"/>
+    <w:bookmarkEnd w:id="30"/>
+    <w:bookmarkStart w:id="31" w:name="how-we-spend-our-time"/>
     <w:p>
       <w:pPr>
         <w:pStyle w:val="Heading2"/>
@@ -1943,8 +1888,8 @@
         <w:t xml:space="preserve">Message me on Slack, and I’ll unlock material early. This is especially worth doing if you’re also working through CS50P and wanting to earn the CS50 certificate.</w:t>
       </w:r>
     </w:p>
-    <w:bookmarkEnd w:id="34"/>
-    <w:bookmarkStart w:id="35" w:name="attendance"/>
+    <w:bookmarkEnd w:id="31"/>
+    <w:bookmarkStart w:id="32" w:name="attendance"/>
     <w:p>
       <w:pPr>
         <w:pStyle w:val="Heading2"/>
@@ -2026,8 +1971,8 @@
         <w:t xml:space="preserve">Absences for reasons of faith or conscience are accommodated. See Student rights.</w:t>
       </w:r>
     </w:p>
-    <w:bookmarkEnd w:id="35"/>
-    <w:bookmarkStart w:id="37" w:name="if-you-need-an-accommodation"/>
+    <w:bookmarkEnd w:id="32"/>
+    <w:bookmarkStart w:id="34" w:name="if-you-need-an-accommodation"/>
     <w:p>
       <w:pPr>
         <w:pStyle w:val="Heading2"/>
@@ -2046,7 +1991,7 @@
       <w:r>
         <w:t xml:space="preserve"> </w:t>
       </w:r>
-      <w:hyperlink r:id="rId36">
+      <w:hyperlink r:id="rId33">
         <w:r>
           <w:rPr>
             <w:rStyle w:val="Hyperlink"/>
@@ -2068,9 +2013,9 @@
         </w:pict>
       </w:r>
     </w:p>
-    <w:bookmarkEnd w:id="37"/>
-    <w:bookmarkEnd w:id="38"/>
-    <w:bookmarkStart w:id="42" w:name="what-youll-need"/>
+    <w:bookmarkEnd w:id="34"/>
+    <w:bookmarkEnd w:id="35"/>
+    <w:bookmarkStart w:id="39" w:name="what-youll-need"/>
     <w:p>
       <w:pPr>
         <w:pStyle w:val="Heading1"/>
@@ -2175,7 +2120,7 @@
               <w:pStyle w:val="Compact"/>
               <w:jc w:val="left"/>
             </w:pPr>
-            <w:hyperlink r:id="rId26">
+            <w:hyperlink r:id="rId23">
               <w:r>
                 <w:rPr>
                   <w:rStyle w:val="Hyperlink"/>
@@ -2374,7 +2319,7 @@
               <w:pStyle w:val="Compact"/>
               <w:jc w:val="left"/>
             </w:pPr>
-            <w:hyperlink r:id="rId25">
+            <w:hyperlink r:id="rId22">
               <w:r>
                 <w:rPr>
                   <w:rStyle w:val="Hyperlink"/>
@@ -2399,7 +2344,7 @@
       <w:r>
         <w:t xml:space="preserve">You’ll also need to be comfortable using Canvas (</w:t>
       </w:r>
-      <w:hyperlink r:id="rId39">
+      <w:hyperlink r:id="rId36">
         <w:r>
           <w:rPr>
             <w:rStyle w:val="Hyperlink"/>
@@ -2497,7 +2442,7 @@
       <w:r>
         <w:t xml:space="preserve"> </w:t>
       </w:r>
-      <w:hyperlink r:id="rId40">
+      <w:hyperlink r:id="rId37">
         <w:r>
           <w:rPr>
             <w:rStyle w:val="Hyperlink"/>
@@ -2511,7 +2456,7 @@
       <w:r>
         <w:t xml:space="preserve"> </w:t>
       </w:r>
-      <w:hyperlink r:id="rId41">
+      <w:hyperlink r:id="rId38">
         <w:r>
           <w:rPr>
             <w:rStyle w:val="Hyperlink"/>
@@ -2533,8 +2478,8 @@
         </w:pict>
       </w:r>
     </w:p>
-    <w:bookmarkEnd w:id="42"/>
-    <w:bookmarkStart w:id="49" w:name="how-youll-be-graded"/>
+    <w:bookmarkEnd w:id="39"/>
+    <w:bookmarkStart w:id="46" w:name="how-youll-be-graded"/>
     <w:p>
       <w:pPr>
         <w:pStyle w:val="Heading1"/>
@@ -2543,7 +2488,7 @@
         <w:t xml:space="preserve">How you’ll be graded</w:t>
       </w:r>
     </w:p>
-    <w:bookmarkStart w:id="43" w:name="where-your-grade-comes-from"/>
+    <w:bookmarkStart w:id="40" w:name="where-your-grade-comes-from"/>
     <w:p>
       <w:pPr>
         <w:pStyle w:val="Heading2"/>
@@ -2947,8 +2892,8 @@
         <w:t xml:space="preserve">.</w:t>
       </w:r>
     </w:p>
-    <w:bookmarkEnd w:id="43"/>
-    <w:bookmarkStart w:id="44" w:name="the-details"/>
+    <w:bookmarkEnd w:id="40"/>
+    <w:bookmarkStart w:id="41" w:name="the-details"/>
     <w:p>
       <w:pPr>
         <w:pStyle w:val="Heading2"/>
@@ -3376,8 +3321,8 @@
         <w:t xml:space="preserve">Rubrics for every assessment live in the relevant Canvas module.</w:t>
       </w:r>
     </w:p>
-    <w:bookmarkEnd w:id="44"/>
-    <w:bookmarkStart w:id="45" w:name="how-participation-works"/>
+    <w:bookmarkEnd w:id="41"/>
+    <w:bookmarkStart w:id="42" w:name="how-participation-works"/>
     <w:p>
       <w:pPr>
         <w:pStyle w:val="Heading2"/>
@@ -3591,8 +3536,8 @@
         <w:t xml:space="preserve">— including as part of a DAC accommodation — tell me in the first two weeks. There’s a written alternative for every in-class component. Setting it up is routine and completely unremarkable.</w:t>
       </w:r>
     </w:p>
-    <w:bookmarkEnd w:id="45"/>
-    <w:bookmarkStart w:id="46" w:name="grading-scale"/>
+    <w:bookmarkEnd w:id="42"/>
+    <w:bookmarkStart w:id="43" w:name="grading-scale"/>
     <w:p>
       <w:pPr>
         <w:pStyle w:val="Heading2"/>
@@ -4018,8 +3963,8 @@
         <w:t xml:space="preserve">is possible only if you’ve completed most of the course in good standing and something unexpected stops you from finishing. It takes a written agreement between us with a deadline, and it isn’t a substitute for withdrawing.</w:t>
       </w:r>
     </w:p>
-    <w:bookmarkEnd w:id="46"/>
-    <w:bookmarkStart w:id="47" w:name="late-work"/>
+    <w:bookmarkEnd w:id="43"/>
+    <w:bookmarkStart w:id="44" w:name="late-work"/>
     <w:p>
       <w:pPr>
         <w:pStyle w:val="Heading2"/>
@@ -4176,8 +4121,8 @@
         <w:t xml:space="preserve">Work that lands weeks or months late has lost most of its value, because it no longer connects to anything the class is doing. That’s the reason for the window, and it’s why talking to me early works so much better than going quiet.</w:t>
       </w:r>
     </w:p>
-    <w:bookmarkEnd w:id="47"/>
-    <w:bookmarkStart w:id="48" w:name="feedback"/>
+    <w:bookmarkEnd w:id="44"/>
+    <w:bookmarkStart w:id="45" w:name="feedback"/>
     <w:p>
       <w:pPr>
         <w:pStyle w:val="Heading2"/>
@@ -4201,9 +4146,9 @@
         </w:pict>
       </w:r>
     </w:p>
-    <w:bookmarkEnd w:id="48"/>
-    <w:bookmarkEnd w:id="49"/>
-    <w:bookmarkStart w:id="50" w:name="weekly-schedule"/>
+    <w:bookmarkEnd w:id="45"/>
+    <w:bookmarkEnd w:id="46"/>
+    <w:bookmarkStart w:id="47" w:name="weekly-schedule"/>
     <w:p>
       <w:pPr>
         <w:pStyle w:val="Heading1"/>
@@ -4984,8 +4929,8 @@
         </w:pict>
       </w:r>
     </w:p>
-    <w:bookmarkEnd w:id="50"/>
-    <w:bookmarkStart w:id="60" w:name="course-agreements"/>
+    <w:bookmarkEnd w:id="47"/>
+    <w:bookmarkStart w:id="57" w:name="course-agreements"/>
     <w:p>
       <w:pPr>
         <w:pStyle w:val="Heading1"/>
@@ -4994,7 +4939,7 @@
         <w:t xml:space="preserve">Course agreements</w:t>
       </w:r>
     </w:p>
-    <w:bookmarkStart w:id="51" w:name="communication"/>
+    <w:bookmarkStart w:id="48" w:name="communication"/>
     <w:p>
       <w:pPr>
         <w:pStyle w:val="Heading2"/>
@@ -5029,8 +4974,8 @@
         <w:t xml:space="preserve">On netiquette: there are real people on the other side of every message. Use the same courtesy online that you’d use face-to-face.</w:t>
       </w:r>
     </w:p>
-    <w:bookmarkEnd w:id="51"/>
-    <w:bookmarkStart w:id="52" w:name="ai-guidelines"/>
+    <w:bookmarkEnd w:id="48"/>
+    <w:bookmarkStart w:id="49" w:name="ai-guidelines"/>
     <w:p>
       <w:pPr>
         <w:pStyle w:val="Heading2"/>
@@ -5132,7 +5077,7 @@
             <w:r>
               <w:t xml:space="preserve">(</w:t>
             </w:r>
-            <w:hyperlink r:id="rId25">
+            <w:hyperlink r:id="rId22">
               <w:r>
                 <w:rPr>
                   <w:rStyle w:val="Hyperlink"/>
@@ -5200,7 +5145,7 @@
               <w:pStyle w:val="Compact"/>
               <w:jc w:val="left"/>
             </w:pPr>
-            <w:hyperlink r:id="rId26">
+            <w:hyperlink r:id="rId23">
               <w:r>
                 <w:rPr>
                   <w:rStyle w:val="Hyperlink"/>
@@ -5283,8 +5228,8 @@
         <w:t xml:space="preserve">Asking has never once counted against a student.</w:t>
       </w:r>
     </w:p>
-    <w:bookmarkEnd w:id="52"/>
-    <w:bookmarkStart w:id="54" w:name="academic-honesty"/>
+    <w:bookmarkEnd w:id="49"/>
+    <w:bookmarkStart w:id="51" w:name="academic-honesty"/>
     <w:p>
       <w:pPr>
         <w:pStyle w:val="Heading2"/>
@@ -5687,7 +5632,7 @@
       <w:r>
         <w:t xml:space="preserve"> </w:t>
       </w:r>
-      <w:hyperlink r:id="rId53">
+      <w:hyperlink r:id="rId50">
         <w:r>
           <w:rPr>
             <w:rStyle w:val="Hyperlink"/>
@@ -5738,8 +5683,8 @@
         <w:t xml:space="preserve">Asking in good faith never counts against you.</w:t>
       </w:r>
     </w:p>
-    <w:bookmarkEnd w:id="54"/>
-    <w:bookmarkStart w:id="55" w:name="classroom-norms"/>
+    <w:bookmarkEnd w:id="51"/>
+    <w:bookmarkStart w:id="52" w:name="classroom-norms"/>
     <w:p>
       <w:pPr>
         <w:pStyle w:val="Heading2"/>
@@ -5808,8 +5753,8 @@
         <w:t xml:space="preserve">Tell me as early as you can about anything that affects your ability to take part fully.</w:t>
       </w:r>
     </w:p>
-    <w:bookmarkEnd w:id="55"/>
-    <w:bookmarkStart w:id="56" w:name="recording-class-sessions"/>
+    <w:bookmarkEnd w:id="52"/>
+    <w:bookmarkStart w:id="53" w:name="recording-class-sessions"/>
     <w:p>
       <w:pPr>
         <w:pStyle w:val="Heading2"/>
@@ -5836,8 +5781,8 @@
         <w:t xml:space="preserve">— no permission needed. Please don’t post or share recordings, screenshots, or classmates’ work outside this class. People share half-finished code and honest confusion in a programming class, and that only works if the room feels safe. If DAC has approved recording as an accommodation, you never need to explain that to anyone. If I record a session, I’ll say so and post it in Canvas.</w:t>
       </w:r>
     </w:p>
-    <w:bookmarkEnd w:id="56"/>
-    <w:bookmarkStart w:id="57" w:name="changes-to-this-syllabus"/>
+    <w:bookmarkEnd w:id="53"/>
+    <w:bookmarkStart w:id="54" w:name="changes-to-this-syllabus"/>
     <w:p>
       <w:pPr>
         <w:pStyle w:val="Heading2"/>
@@ -5854,8 +5799,8 @@
         <w:t xml:space="preserve">This is a plan, not a contract, and I may adjust it during the quarter. Anything that affects your grade or deadlines is announced on Canvas and Slack, and I’ll post an updated syllabus.</w:t>
       </w:r>
     </w:p>
-    <w:bookmarkEnd w:id="57"/>
-    <w:bookmarkStart w:id="59" w:name="withdrawing-from-the-course"/>
+    <w:bookmarkEnd w:id="54"/>
+    <w:bookmarkStart w:id="56" w:name="withdrawing-from-the-course"/>
     <w:p>
       <w:pPr>
         <w:pStyle w:val="Heading2"/>
@@ -5905,7 +5850,7 @@
       <w:r>
         <w:t xml:space="preserve"> </w:t>
       </w:r>
-      <w:hyperlink r:id="rId58">
+      <w:hyperlink r:id="rId55">
         <w:r>
           <w:rPr>
             <w:rStyle w:val="Hyperlink"/>
@@ -5945,9 +5890,9 @@
         </w:pict>
       </w:r>
     </w:p>
-    <w:bookmarkEnd w:id="59"/>
-    <w:bookmarkEnd w:id="60"/>
-    <w:bookmarkStart w:id="61" w:name="what-youll-be-able-to-do-by-the-end"/>
+    <w:bookmarkEnd w:id="56"/>
+    <w:bookmarkEnd w:id="57"/>
+    <w:bookmarkStart w:id="58" w:name="what-youll-be-able-to-do-by-the-end"/>
     <w:p>
       <w:pPr>
         <w:pStyle w:val="Heading1"/>
@@ -6476,8 +6421,8 @@
         </w:pict>
       </w:r>
     </w:p>
-    <w:bookmarkEnd w:id="61"/>
-    <w:bookmarkStart w:id="81" w:name="college-policies"/>
+    <w:bookmarkEnd w:id="58"/>
+    <w:bookmarkStart w:id="78" w:name="college-policies"/>
     <w:p>
       <w:pPr>
         <w:pStyle w:val="Heading1"/>
@@ -6486,7 +6431,7 @@
         <w:t xml:space="preserve">College policies</w:t>
       </w:r>
     </w:p>
-    <w:bookmarkStart w:id="66" w:name="ada-accommodations"/>
+    <w:bookmarkStart w:id="63" w:name="ada-accommodations"/>
     <w:p>
       <w:pPr>
         <w:pStyle w:val="Heading2"/>
@@ -6521,7 +6466,7 @@
       <w:r>
         <w:t xml:space="preserve"> </w:t>
       </w:r>
-      <w:hyperlink r:id="rId62">
+      <w:hyperlink r:id="rId59">
         <w:r>
           <w:rPr>
             <w:rStyle w:val="Hyperlink"/>
@@ -6598,7 +6543,7 @@
               <w:pStyle w:val="Compact"/>
               <w:jc w:val="left"/>
             </w:pPr>
-            <w:hyperlink r:id="rId63">
+            <w:hyperlink r:id="rId60">
               <w:r>
                 <w:rPr>
                   <w:rStyle w:val="Hyperlink"/>
@@ -6615,7 +6560,7 @@
             <w:r>
               <w:t xml:space="preserve"> </w:t>
             </w:r>
-            <w:hyperlink r:id="rId64">
+            <w:hyperlink r:id="rId61">
               <w:r>
                 <w:rPr>
                   <w:rStyle w:val="Hyperlink"/>
@@ -6683,7 +6628,7 @@
       <w:r>
         <w:t xml:space="preserve"> </w:t>
       </w:r>
-      <w:hyperlink r:id="rId65">
+      <w:hyperlink r:id="rId62">
         <w:r>
           <w:rPr>
             <w:rStyle w:val="Hyperlink"/>
@@ -6719,8 +6664,8 @@
         <w:t xml:space="preserve">Once your accommodations are set, contact me so we can talk about this course specifically. If you have any emergency medical information I should know about, tell me by the end of week one.</w:t>
       </w:r>
     </w:p>
-    <w:bookmarkEnd w:id="66"/>
-    <w:bookmarkStart w:id="68" w:name="non-discrimination"/>
+    <w:bookmarkEnd w:id="63"/>
+    <w:bookmarkStart w:id="65" w:name="non-discrimination"/>
     <w:p>
       <w:pPr>
         <w:pStyle w:val="Heading2"/>
@@ -6747,7 +6692,7 @@
       <w:r>
         <w:t xml:space="preserve"> </w:t>
       </w:r>
-      <w:hyperlink r:id="rId67">
+      <w:hyperlink r:id="rId64">
         <w:r>
           <w:rPr>
             <w:rStyle w:val="Hyperlink"/>
@@ -6759,8 +6704,8 @@
         <w:t xml:space="preserve">.</w:t>
       </w:r>
     </w:p>
-    <w:bookmarkEnd w:id="68"/>
-    <w:bookmarkStart w:id="74" w:name="title-ix-and-sexual-misconduct"/>
+    <w:bookmarkEnd w:id="65"/>
+    <w:bookmarkStart w:id="71" w:name="title-ix-and-sexual-misconduct"/>
     <w:p>
       <w:pPr>
         <w:pStyle w:val="Heading2"/>
@@ -6803,7 +6748,7 @@
         </w:numPr>
         <w:pStyle w:val="Compact"/>
       </w:pPr>
-      <w:hyperlink r:id="rId69">
+      <w:hyperlink r:id="rId66">
         <w:r>
           <w:rPr>
             <w:rStyle w:val="Hyperlink"/>
@@ -6820,7 +6765,7 @@
         </w:numPr>
         <w:pStyle w:val="Compact"/>
       </w:pPr>
-      <w:hyperlink r:id="rId70">
+      <w:hyperlink r:id="rId67">
         <w:r>
           <w:rPr>
             <w:rStyle w:val="Hyperlink"/>
@@ -6837,7 +6782,7 @@
         </w:numPr>
         <w:pStyle w:val="Compact"/>
       </w:pPr>
-      <w:hyperlink r:id="rId71">
+      <w:hyperlink r:id="rId68">
         <w:r>
           <w:rPr>
             <w:rStyle w:val="Hyperlink"/>
@@ -6854,7 +6799,7 @@
         </w:numPr>
         <w:pStyle w:val="Compact"/>
       </w:pPr>
-      <w:hyperlink r:id="rId72">
+      <w:hyperlink r:id="rId69">
         <w:r>
           <w:rPr>
             <w:rStyle w:val="Hyperlink"/>
@@ -6871,7 +6816,7 @@
         </w:numPr>
         <w:pStyle w:val="Compact"/>
       </w:pPr>
-      <w:hyperlink r:id="rId73">
+      <w:hyperlink r:id="rId70">
         <w:r>
           <w:rPr>
             <w:rStyle w:val="Hyperlink"/>
@@ -6880,8 +6825,8 @@
         </w:r>
       </w:hyperlink>
     </w:p>
-    <w:bookmarkEnd w:id="74"/>
-    <w:bookmarkStart w:id="76" w:name="student-rights-and-responsibilities"/>
+    <w:bookmarkEnd w:id="71"/>
+    <w:bookmarkStart w:id="73" w:name="student-rights-and-responsibilities"/>
     <w:p>
       <w:pPr>
         <w:pStyle w:val="Heading2"/>
@@ -6900,7 +6845,7 @@
       <w:r>
         <w:t xml:space="preserve"> </w:t>
       </w:r>
-      <w:hyperlink r:id="rId75">
+      <w:hyperlink r:id="rId72">
         <w:r>
           <w:rPr>
             <w:rStyle w:val="Hyperlink"/>
@@ -6931,8 +6876,8 @@
         <w:t xml:space="preserve">— no explanation needed beyond that.</w:t>
       </w:r>
     </w:p>
-    <w:bookmarkEnd w:id="76"/>
-    <w:bookmarkStart w:id="77" w:name="academic-dishonesty"/>
+    <w:bookmarkEnd w:id="73"/>
+    <w:bookmarkStart w:id="74" w:name="academic-dishonesty"/>
     <w:p>
       <w:pPr>
         <w:pStyle w:val="Heading2"/>
@@ -7029,8 +6974,8 @@
         <w:t xml:space="preserve">a failing grade on the assignment or, in extreme cases, the course. Students may also be referred to the Student Conduct Office, which can require learning activities or, in extreme or repeated cases, dismissal from a program. To challenge a finding, you can file a grade appeal starting with the division chair.</w:t>
       </w:r>
     </w:p>
-    <w:bookmarkEnd w:id="77"/>
-    <w:bookmarkStart w:id="80" w:name="emergencies"/>
+    <w:bookmarkEnd w:id="74"/>
+    <w:bookmarkStart w:id="77" w:name="emergencies"/>
     <w:p>
       <w:pPr>
         <w:pStyle w:val="Heading2"/>
@@ -7109,7 +7054,7 @@
             <w:r>
               <w:t xml:space="preserve"> </w:t>
             </w:r>
-            <w:hyperlink r:id="rId78">
+            <w:hyperlink r:id="rId75">
               <w:r>
                 <w:rPr>
                   <w:rStyle w:val="Hyperlink"/>
@@ -7156,7 +7101,7 @@
             <w:r>
               <w:t xml:space="preserve"> </w:t>
             </w:r>
-            <w:hyperlink r:id="rId79">
+            <w:hyperlink r:id="rId76">
               <w:r>
                 <w:rPr>
                   <w:rStyle w:val="Hyperlink"/>
@@ -7246,9 +7191,9 @@
         </w:pict>
       </w:r>
     </w:p>
-    <w:bookmarkEnd w:id="80"/>
-    <w:bookmarkEnd w:id="81"/>
-    <w:bookmarkStart w:id="113" w:name="where-to-get-help"/>
+    <w:bookmarkEnd w:id="77"/>
+    <w:bookmarkEnd w:id="78"/>
+    <w:bookmarkStart w:id="110" w:name="where-to-get-help"/>
     <w:p>
       <w:pPr>
         <w:pStyle w:val="Heading1"/>
@@ -7275,7 +7220,7 @@
         <w:t xml:space="preserve">Please use these.</w:t>
       </w:r>
     </w:p>
-    <w:bookmarkStart w:id="86" w:name="course-help"/>
+    <w:bookmarkStart w:id="83" w:name="course-help"/>
     <w:p>
       <w:pPr>
         <w:pStyle w:val="Heading2"/>
@@ -7373,7 +7318,7 @@
             <w:r>
               <w:t xml:space="preserve">The CS50 Duck (</w:t>
             </w:r>
-            <w:hyperlink r:id="rId25">
+            <w:hyperlink r:id="rId22">
               <w:r>
                 <w:rPr>
                   <w:rStyle w:val="Hyperlink"/>
@@ -7407,7 +7352,7 @@
               <w:pStyle w:val="Compact"/>
               <w:jc w:val="left"/>
             </w:pPr>
-            <w:hyperlink r:id="rId82">
+            <w:hyperlink r:id="rId79">
               <w:r>
                 <w:rPr>
                   <w:rStyle w:val="Hyperlink"/>
@@ -7424,7 +7369,7 @@
             <w:r>
               <w:t xml:space="preserve"> </w:t>
             </w:r>
-            <w:hyperlink r:id="rId83">
+            <w:hyperlink r:id="rId80">
               <w:r>
                 <w:rPr>
                   <w:rStyle w:val="Hyperlink"/>
@@ -7455,7 +7400,7 @@
               <w:pStyle w:val="Compact"/>
               <w:jc w:val="left"/>
             </w:pPr>
-            <w:hyperlink r:id="rId84">
+            <w:hyperlink r:id="rId81">
               <w:r>
                 <w:rPr>
                   <w:rStyle w:val="Hyperlink"/>
@@ -7472,7 +7417,7 @@
             <w:r>
               <w:t xml:space="preserve"> </w:t>
             </w:r>
-            <w:hyperlink r:id="rId85">
+            <w:hyperlink r:id="rId82">
               <w:r>
                 <w:rPr>
                   <w:rStyle w:val="Hyperlink"/>
@@ -7484,8 +7429,8 @@
         </w:tc>
       </w:tr>
     </w:tbl>
-    <w:bookmarkEnd w:id="86"/>
-    <w:bookmarkStart w:id="95" w:name="tech-help"/>
+    <w:bookmarkEnd w:id="83"/>
+    <w:bookmarkStart w:id="92" w:name="tech-help"/>
     <w:p>
       <w:pPr>
         <w:pStyle w:val="Heading2"/>
@@ -7554,7 +7499,7 @@
               <w:pStyle w:val="Compact"/>
               <w:jc w:val="left"/>
             </w:pPr>
-            <w:hyperlink r:id="rId87">
+            <w:hyperlink r:id="rId84">
               <w:r>
                 <w:rPr>
                   <w:rStyle w:val="Hyperlink"/>
@@ -7571,7 +7516,7 @@
             <w:r>
               <w:t xml:space="preserve"> </w:t>
             </w:r>
-            <w:hyperlink r:id="rId88">
+            <w:hyperlink r:id="rId85">
               <w:r>
                 <w:rPr>
                   <w:rStyle w:val="Hyperlink"/>
@@ -7648,7 +7593,7 @@
             <w:r>
               <w:t xml:space="preserve"> </w:t>
             </w:r>
-            <w:hyperlink r:id="rId89">
+            <w:hyperlink r:id="rId86">
               <w:r>
                 <w:rPr>
                   <w:rStyle w:val="Hyperlink"/>
@@ -7679,7 +7624,7 @@
               <w:pStyle w:val="Compact"/>
               <w:jc w:val="left"/>
             </w:pPr>
-            <w:hyperlink r:id="rId90">
+            <w:hyperlink r:id="rId87">
               <w:r>
                 <w:rPr>
                   <w:rStyle w:val="Hyperlink"/>
@@ -7713,7 +7658,7 @@
               <w:pStyle w:val="Compact"/>
               <w:jc w:val="left"/>
             </w:pPr>
-            <w:hyperlink r:id="rId91">
+            <w:hyperlink r:id="rId88">
               <w:r>
                 <w:rPr>
                   <w:rStyle w:val="Hyperlink"/>
@@ -7744,7 +7689,7 @@
               <w:pStyle w:val="Compact"/>
               <w:jc w:val="left"/>
             </w:pPr>
-            <w:hyperlink r:id="rId92">
+            <w:hyperlink r:id="rId89">
               <w:r>
                 <w:rPr>
                   <w:rStyle w:val="Hyperlink"/>
@@ -7761,7 +7706,7 @@
             <w:r>
               <w:t xml:space="preserve"> </w:t>
             </w:r>
-            <w:hyperlink r:id="rId93">
+            <w:hyperlink r:id="rId90">
               <w:r>
                 <w:rPr>
                   <w:rStyle w:val="Hyperlink"/>
@@ -7778,7 +7723,7 @@
             <w:r>
               <w:t xml:space="preserve"> </w:t>
             </w:r>
-            <w:hyperlink r:id="rId94">
+            <w:hyperlink r:id="rId91">
               <w:r>
                 <w:rPr>
                   <w:rStyle w:val="Hyperlink"/>
@@ -7790,8 +7735,8 @@
         </w:tc>
       </w:tr>
     </w:tbl>
-    <w:bookmarkEnd w:id="95"/>
-    <w:bookmarkStart w:id="112" w:name="life-help"/>
+    <w:bookmarkEnd w:id="92"/>
+    <w:bookmarkStart w:id="109" w:name="life-help"/>
     <w:p>
       <w:pPr>
         <w:pStyle w:val="Heading2"/>
@@ -7860,7 +7805,7 @@
               <w:pStyle w:val="Compact"/>
               <w:jc w:val="left"/>
             </w:pPr>
-            <w:hyperlink r:id="rId96">
+            <w:hyperlink r:id="rId93">
               <w:r>
                 <w:rPr>
                   <w:rStyle w:val="Hyperlink"/>
@@ -7877,7 +7822,7 @@
             <w:r>
               <w:t xml:space="preserve"> </w:t>
             </w:r>
-            <w:hyperlink r:id="rId97">
+            <w:hyperlink r:id="rId94">
               <w:r>
                 <w:rPr>
                   <w:rStyle w:val="Hyperlink"/>
@@ -7894,7 +7839,7 @@
             <w:r>
               <w:t xml:space="preserve"> </w:t>
             </w:r>
-            <w:hyperlink r:id="rId98">
+            <w:hyperlink r:id="rId95">
               <w:r>
                 <w:rPr>
                   <w:rStyle w:val="Hyperlink"/>
@@ -7925,7 +7870,7 @@
               <w:pStyle w:val="Compact"/>
               <w:jc w:val="left"/>
             </w:pPr>
-            <w:hyperlink r:id="rId99">
+            <w:hyperlink r:id="rId96">
               <w:r>
                 <w:rPr>
                   <w:rStyle w:val="Hyperlink"/>
@@ -7939,7 +7884,7 @@
             <w:r>
               <w:t xml:space="preserve">— monthly food boxes; contact Cath Busha, Dean of Student Engagement (</w:t>
             </w:r>
-            <w:hyperlink r:id="rId100">
+            <w:hyperlink r:id="rId97">
               <w:r>
                 <w:rPr>
                   <w:rStyle w:val="Hyperlink"/>
@@ -7973,7 +7918,7 @@
               <w:pStyle w:val="Compact"/>
               <w:jc w:val="left"/>
             </w:pPr>
-            <w:hyperlink r:id="rId73">
+            <w:hyperlink r:id="rId70">
               <w:r>
                 <w:rPr>
                   <w:rStyle w:val="Hyperlink"/>
@@ -8004,7 +7949,7 @@
               <w:pStyle w:val="Compact"/>
               <w:jc w:val="left"/>
             </w:pPr>
-            <w:hyperlink r:id="rId101">
+            <w:hyperlink r:id="rId98">
               <w:r>
                 <w:rPr>
                   <w:rStyle w:val="Hyperlink"/>
@@ -8041,7 +7986,7 @@
               <w:pStyle w:val="Compact"/>
               <w:jc w:val="left"/>
             </w:pPr>
-            <w:hyperlink r:id="rId102">
+            <w:hyperlink r:id="rId99">
               <w:r>
                 <w:rPr>
                   <w:rStyle w:val="Hyperlink"/>
@@ -8058,7 +8003,7 @@
             <w:r>
               <w:t xml:space="preserve"> </w:t>
             </w:r>
-            <w:hyperlink r:id="rId103">
+            <w:hyperlink r:id="rId100">
               <w:r>
                 <w:rPr>
                   <w:rStyle w:val="Hyperlink"/>
@@ -8089,7 +8034,7 @@
               <w:pStyle w:val="Compact"/>
               <w:jc w:val="left"/>
             </w:pPr>
-            <w:hyperlink r:id="rId104">
+            <w:hyperlink r:id="rId101">
               <w:r>
                 <w:rPr>
                   <w:rStyle w:val="Hyperlink"/>
@@ -8106,7 +8051,7 @@
             <w:r>
               <w:t xml:space="preserve"> </w:t>
             </w:r>
-            <w:hyperlink r:id="rId105">
+            <w:hyperlink r:id="rId102">
               <w:r>
                 <w:rPr>
                   <w:rStyle w:val="Hyperlink"/>
@@ -8137,7 +8082,7 @@
               <w:pStyle w:val="Compact"/>
               <w:jc w:val="left"/>
             </w:pPr>
-            <w:hyperlink r:id="rId106">
+            <w:hyperlink r:id="rId103">
               <w:r>
                 <w:rPr>
                   <w:rStyle w:val="Hyperlink"/>
@@ -8174,7 +8119,7 @@
               <w:pStyle w:val="Compact"/>
               <w:jc w:val="left"/>
             </w:pPr>
-            <w:hyperlink r:id="rId107">
+            <w:hyperlink r:id="rId104">
               <w:r>
                 <w:rPr>
                   <w:rStyle w:val="Hyperlink"/>
@@ -8191,7 +8136,7 @@
             <w:r>
               <w:t xml:space="preserve"> </w:t>
             </w:r>
-            <w:hyperlink r:id="rId108">
+            <w:hyperlink r:id="rId105">
               <w:r>
                 <w:rPr>
                   <w:rStyle w:val="Hyperlink"/>
@@ -8237,7 +8182,7 @@
       <w:r>
         <w:t xml:space="preserve"> </w:t>
       </w:r>
-      <w:hyperlink r:id="rId109">
+      <w:hyperlink r:id="rId106">
         <w:r>
           <w:rPr>
             <w:rStyle w:val="Hyperlink"/>
@@ -8251,7 +8196,7 @@
       <w:r>
         <w:t xml:space="preserve"> </w:t>
       </w:r>
-      <w:hyperlink r:id="rId110">
+      <w:hyperlink r:id="rId107">
         <w:r>
           <w:rPr>
             <w:rStyle w:val="Hyperlink"/>
@@ -8268,7 +8213,7 @@
       <w:r>
         <w:t xml:space="preserve"> </w:t>
       </w:r>
-      <w:hyperlink r:id="rId111">
+      <w:hyperlink r:id="rId108">
         <w:r>
           <w:rPr>
             <w:rStyle w:val="Hyperlink"/>
@@ -8287,9 +8232,9 @@
         </w:pict>
       </w:r>
     </w:p>
-    <w:bookmarkEnd w:id="112"/>
-    <w:bookmarkEnd w:id="113"/>
-    <w:bookmarkStart w:id="114" w:name="one-last-thing"/>
+    <w:bookmarkEnd w:id="109"/>
+    <w:bookmarkEnd w:id="110"/>
+    <w:bookmarkStart w:id="111" w:name="one-last-thing"/>
     <w:p>
       <w:pPr>
         <w:pStyle w:val="Heading1"/>
@@ -8326,7 +8271,7 @@
         <w:t xml:space="preserve">— Bruce</w:t>
       </w:r>
     </w:p>
-    <w:bookmarkEnd w:id="114"/>
+    <w:bookmarkEnd w:id="111"/>
     <w:sectPr>
       <w:pgSz w:w="12240" w:h="15840"/>
       <w:pgMar w:top="1440" w:right="1440" w:bottom="1440" w:left="1440" w:header="720" w:footer="720" w:gutter="0"/>

</xml_diff>

<commit_message>
AI policy: state the assigned-AI exception everywhere, not just once
The "When AI is assigned" row already said some assignments will ask
students to use AI beyond the CS50 Duck, but three other places stated
the ban absolutely: the Start here panel, the AI table's "Not allowed
on submitted work" row, and the academic honesty table. A student who
read the summary or the honesty table and stopped there was told the
opposite of the actual policy.

Adds the qualifier in all four spots across the markdown, the web page
and the Day One handout, without naming specific tools. 37 build checks
pass; handout still one page (982.4px of 990.7px).

Co-Authored-By: Claude Opus 5 <noreply@anthropic.com>
Claude-Session: https://claude.ai/code/session_018x18zWwXGxwsgkDproSP2N
</commit_message>
<xml_diff>
--- a/fall-2026/ctec121/CTEC_121_Syllabus_Fall_2026.docx
+++ b/fall-2026/ctec121/CTEC_121_Syllabus_Fall_2026.docx
@@ -524,7 +524,7 @@
               </w:r>
             </w:hyperlink>
             <w:r>
-              <w:t xml:space="preserve">) is always allowed. No other AI may write, complete, or suggest code you turn in — though using one to explain a concept or an error message is fine, as long as you say so in a comment. You’ll write your code in</w:t>
+              <w:t xml:space="preserve">) is always allowed. No other AI may write, complete, or suggest code you turn in — unless an assignment says otherwise, and some will. Using one to explain a concept or an error message is fine any time, as long as you say so in a comment. You’ll write your code in</w:t>
             </w:r>
             <w:r>
               <w:t xml:space="preserve"> </w:t>
@@ -5590,7 +5590,23 @@
               <w:jc w:val="left"/>
             </w:pPr>
             <w:r>
-              <w:t xml:space="preserve">Any other AI that suggests, completes, or generates code — ChatGPT, Claude, Gemini, GitHub Copilot, Cursor, and the AI features now baked into editors and browsers. Submitting AI-written code is treated the same as submitting another person’s code.</w:t>
+              <w:t xml:space="preserve">Any other AI that suggests, completes, or generates code — ChatGPT, Claude, Gemini, GitHub Copilot, Cursor, and the AI features now baked into editors and browsers — unless that assignment says otherwise; see</w:t>
+            </w:r>
+            <w:r>
+              <w:t xml:space="preserve"> </w:t>
+            </w:r>
+            <w:r>
+              <w:rPr>
+                <w:bCs/>
+                <w:b/>
+              </w:rPr>
+              <w:t xml:space="preserve">When AI is assigned</w:t>
+            </w:r>
+            <w:r>
+              <w:t xml:space="preserve"> </w:t>
+            </w:r>
+            <w:r>
+              <w:t xml:space="preserve">below. Submitting AI-written code is treated the same as submitting another person’s code.</w:t>
             </w:r>
           </w:p>
         </w:tc>
@@ -6090,19 +6106,19 @@
               <w:jc w:val="left"/>
             </w:pPr>
             <w:r>
-              <w:t xml:space="preserve">Using the CS50 Duck · asking another AI to explain a concept or an error message, and citing it in a comment</w:t>
-            </w:r>
-          </w:p>
-        </w:tc>
-        <w:tc>
-          <w:tcPr/>
-          <w:p>
-            <w:pPr>
-              <w:pStyle w:val="Compact"/>
-              <w:jc w:val="left"/>
-            </w:pPr>
-            <w:r>
-              <w:t xml:space="preserve">Using any other AI to write, complete, or suggest code you submit</w:t>
+              <w:t xml:space="preserve">Using the CS50 Duck · asking another AI to explain a concept or an error message, and citing it in a comment · using AI beyond the Duck when an assignment explicitly assigns it</w:t>
+            </w:r>
+          </w:p>
+        </w:tc>
+        <w:tc>
+          <w:tcPr/>
+          <w:p>
+            <w:pPr>
+              <w:pStyle w:val="Compact"/>
+              <w:jc w:val="left"/>
+            </w:pPr>
+            <w:r>
+              <w:t xml:space="preserve">Using any other AI to write, complete, or suggest code you submit, unless that assignment says to</w:t>
             </w:r>
           </w:p>
         </w:tc>

</xml_diff>

<commit_message>
Scope the AI guidelines table to out-of-class work
The AI table had no scope line of its own, so "Always allowed: the CS50
Duck" read as true during the closed-book midterm and final. The academic
honesty table has had such a line since Round 2; this one did not. Adds
one sentence under the table, and narrows the handout's AI bullet to
"always allowed on take-home work".

37 build checks pass. The handout absorbed the four extra words inside
existing line wraps -- still 982.4px of 990.7px, still one page.

Co-Authored-By: Claude Opus 5 <noreply@anthropic.com>
Claude-Session: https://claude.ai/code/session_018x18zWwXGxwsgkDproSP2N
</commit_message>
<xml_diff>
--- a/fall-2026/ctec121/CTEC_121_Syllabus_Fall_2026.docx
+++ b/fall-2026/ctec121/CTEC_121_Syllabus_Fall_2026.docx
@@ -5682,6 +5682,24 @@
         </w:tc>
       </w:tr>
     </w:tbl>
+    <w:p>
+      <w:pPr>
+        <w:pStyle w:val="BodyText"/>
+      </w:pPr>
+      <w:r>
+        <w:rPr>
+          <w:bCs/>
+          <w:b/>
+        </w:rPr>
+        <w:t xml:space="preserve">Everything in this table is about work you do outside class.</w:t>
+      </w:r>
+      <w:r>
+        <w:t xml:space="preserve"> </w:t>
+      </w:r>
+      <w:r>
+        <w:t xml:space="preserve">The quizzes, the midterm and the final exam are closed-book and on paper — no AI, notes, or web, including the Duck.</w:t>
+      </w:r>
+    </w:p>
     <w:p>
       <w:pPr>
         <w:pStyle w:val="BodyText"/>

</xml_diff>

<commit_message>
Correct the CS50 Duck's location, and add the Regret Clause
The Duck is cs50.ai built into VS Code inside cs50.dev -- students never
visit the cs50.ai site -- so every reference now says "built into cs50.dev"
and the five cs50.ai links are gone. The outside-accounts note names
cs50.dev rather than cs50.ai.

Also fixes a fifth unqualified "always allowed": the Start here AI rule
still said the Duck was always allowed, full stop, after the same claim was
scoped in the AI table and the handout on Sept 8. It now reads "always
allowed on take-home work" like the others.

New Regret Clause in Academic honesty: one self-report per quarter, no
penalty and no referral, usable before or after I raise a concern, scoped
to academic honesty. Summarised in Start here as "If you slip up".

37 build checks pass; handout unchanged at 982.4px of 990.7px.

Co-Authored-By: Claude Opus 5 <noreply@anthropic.com>
Claude-Session: https://claude.ai/code/session_018x18zWwXGxwsgkDproSP2N
</commit_message>
<xml_diff>
--- a/fall-2026/ctec121/CTEC_121_Syllabus_Fall_2026.docx
+++ b/fall-2026/ctec121/CTEC_121_Syllabus_Fall_2026.docx
@@ -183,7 +183,7 @@
         </w:pict>
       </w:r>
     </w:p>
-    <w:bookmarkStart w:id="25" w:name="start-here"/>
+    <w:bookmarkStart w:id="24" w:name="start-here"/>
     <w:p>
       <w:pPr>
         <w:pStyle w:val="Heading1"/>
@@ -513,23 +513,12 @@
               <w:jc w:val="left"/>
             </w:pPr>
             <w:r>
-              <w:t xml:space="preserve">The CS50 Duck (</w:t>
+              <w:t xml:space="preserve">The CS50 Duck is always allowed on take-home work. No other AI may write, complete, or suggest code you turn in — unless an assignment says otherwise, and some will. Using one to explain a concept or an error message is fine while you are studying or working on take-home assignments, as long as you say so in a comment. You’ll write your code in</w:t>
+            </w:r>
+            <w:r>
+              <w:t xml:space="preserve"> </w:t>
             </w:r>
             <w:hyperlink r:id="rId22">
-              <w:r>
-                <w:rPr>
-                  <w:rStyle w:val="Hyperlink"/>
-                </w:rPr>
-                <w:t xml:space="preserve">cs50.ai</w:t>
-              </w:r>
-            </w:hyperlink>
-            <w:r>
-              <w:t xml:space="preserve">) is always allowed. No other AI may write, complete, or suggest code you turn in — unless an assignment says otherwise, and some will. Using one to explain a concept or an error message is fine while you are studying or working on take-home assignments, as long as you say so in a comment. You’ll write your code in</w:t>
-            </w:r>
-            <w:r>
-              <w:t xml:space="preserve"> </w:t>
-            </w:r>
-            <w:hyperlink r:id="rId23">
               <w:r>
                 <w:rPr>
                   <w:rStyle w:val="Hyperlink"/>
@@ -540,7 +529,53 @@
               </w:r>
             </w:hyperlink>
             <w:r>
-              <w:t xml:space="preserve">, which already has AI autocomplete turned off.</w:t>
+              <w:t xml:space="preserve">, which has the Duck built in and AI autocomplete turned off.</w:t>
+            </w:r>
+          </w:p>
+        </w:tc>
+      </w:tr>
+      <w:tr>
+        <w:tc>
+          <w:tcPr/>
+          <w:p>
+            <w:pPr>
+              <w:pStyle w:val="Compact"/>
+              <w:jc w:val="left"/>
+            </w:pPr>
+            <w:r>
+              <w:rPr>
+                <w:bCs/>
+                <w:b/>
+              </w:rPr>
+              <w:t xml:space="preserve">If you slip up</w:t>
+            </w:r>
+          </w:p>
+        </w:tc>
+        <w:tc>
+          <w:tcPr/>
+          <w:p>
+            <w:pPr>
+              <w:pStyle w:val="Compact"/>
+              <w:jc w:val="left"/>
+            </w:pPr>
+            <w:r>
+              <w:t xml:space="preserve">The</w:t>
+            </w:r>
+            <w:r>
+              <w:t xml:space="preserve"> </w:t>
+            </w:r>
+            <w:r>
+              <w:rPr>
+                <w:bCs/>
+                <w:b/>
+              </w:rPr>
+              <w:t xml:space="preserve">Regret Clause</w:t>
+            </w:r>
+            <w:r>
+              <w:t xml:space="preserve"> </w:t>
+            </w:r>
+            <w:r>
+              <w:t xml:space="preserve">lets you tell me once, with no penalty. See Academic honesty.</w:t>
             </w:r>
           </w:p>
         </w:tc>
@@ -745,7 +780,7 @@
       <w:r>
         <w:t xml:space="preserve"> </w:t>
       </w:r>
-      <w:hyperlink r:id="rId24">
+      <w:hyperlink r:id="rId23">
         <w:r>
           <w:rPr>
             <w:rStyle w:val="Hyperlink"/>
@@ -835,7 +870,7 @@
         </w:rPr>
         <w:t xml:space="preserve"> </w:t>
       </w:r>
-      <w:hyperlink r:id="rId23">
+      <w:hyperlink r:id="rId22">
         <w:r>
           <w:rPr>
             <w:rStyle w:val="Hyperlink"/>
@@ -892,8 +927,8 @@
         </w:pict>
       </w:r>
     </w:p>
-    <w:bookmarkEnd w:id="25"/>
-    <w:bookmarkStart w:id="27" w:name="the-course-at-a-glance"/>
+    <w:bookmarkEnd w:id="24"/>
+    <w:bookmarkStart w:id="26" w:name="the-course-at-a-glance"/>
     <w:p>
       <w:pPr>
         <w:pStyle w:val="Heading1"/>
@@ -1176,7 +1211,7 @@
               <w:pStyle w:val="Compact"/>
               <w:jc w:val="left"/>
             </w:pPr>
-            <w:hyperlink r:id="rId24">
+            <w:hyperlink r:id="rId23">
               <w:r>
                 <w:rPr>
                   <w:rStyle w:val="Hyperlink"/>
@@ -1322,7 +1357,7 @@
       <w:r>
         <w:t xml:space="preserve"> </w:t>
       </w:r>
-      <w:hyperlink r:id="rId26">
+      <w:hyperlink r:id="rId25">
         <w:r>
           <w:rPr>
             <w:rStyle w:val="Hyperlink"/>
@@ -1365,8 +1400,8 @@
         </w:pict>
       </w:r>
     </w:p>
-    <w:bookmarkEnd w:id="27"/>
-    <w:bookmarkStart w:id="29" w:name="meet-your-instructor"/>
+    <w:bookmarkEnd w:id="26"/>
+    <w:bookmarkStart w:id="28" w:name="meet-your-instructor"/>
     <w:p>
       <w:pPr>
         <w:pStyle w:val="Heading1"/>
@@ -1646,7 +1681,7 @@
         <w:t xml:space="preserve">Something went astray. You are not bothering me.</w:t>
       </w:r>
     </w:p>
-    <w:bookmarkStart w:id="28" w:name="what-i-believe-about-teaching"/>
+    <w:bookmarkStart w:id="27" w:name="what-i-believe-about-teaching"/>
     <w:p>
       <w:pPr>
         <w:pStyle w:val="Heading2"/>
@@ -1792,9 +1827,9 @@
         </w:pict>
       </w:r>
     </w:p>
+    <w:bookmarkEnd w:id="27"/>
     <w:bookmarkEnd w:id="28"/>
-    <w:bookmarkEnd w:id="29"/>
-    <w:bookmarkStart w:id="35" w:name="what-this-class-is-like"/>
+    <w:bookmarkStart w:id="34" w:name="what-this-class-is-like"/>
     <w:p>
       <w:pPr>
         <w:pStyle w:val="Heading1"/>
@@ -1803,7 +1838,7 @@
         <w:t xml:space="preserve">What this class is like</w:t>
       </w:r>
     </w:p>
-    <w:bookmarkStart w:id="30" w:name="why-python"/>
+    <w:bookmarkStart w:id="29" w:name="why-python"/>
     <w:p>
       <w:pPr>
         <w:pStyle w:val="Heading2"/>
@@ -1870,52 +1905,52 @@
         <w:t xml:space="preserve">on your screen can be intimidating at first. That fades faster than you’d think. Coding is really just solving problems in small, careful steps, and that’s a skill you already have.</w:t>
       </w:r>
     </w:p>
+    <w:bookmarkEnd w:id="29"/>
+    <w:bookmarkStart w:id="30" w:name="how-we-spend-our-time"/>
+    <w:p>
+      <w:pPr>
+        <w:pStyle w:val="Heading2"/>
+      </w:pPr>
+      <w:r>
+        <w:t xml:space="preserve">How we spend our time</w:t>
+      </w:r>
+    </w:p>
+    <w:p>
+      <w:pPr>
+        <w:pStyle w:val="FirstParagraph"/>
+      </w:pPr>
+      <w:r>
+        <w:t xml:space="preserve">We’ll use lectures, videos, group activities, hands-on labs, peer critiques, and discussion. You’re expected to take part in class discussions and exercises, and I’d love it if you brought your own real-world examples into them.</w:t>
+      </w:r>
+    </w:p>
+    <w:p>
+      <w:pPr>
+        <w:pStyle w:val="BodyText"/>
+      </w:pPr>
+      <w:r>
+        <w:t xml:space="preserve">Each week you’ll work through a Canvas module: readings, videos, labs, a problem set, and a collaborative assignment. Most weeks also open with a short in-class quiz on the module you just finished — eight across the quarter, on the dates in the schedule. Modules open on Sundays, except Modules 0 and 1, which open on the first day of class.</w:t>
+      </w:r>
+    </w:p>
+    <w:p>
+      <w:pPr>
+        <w:pStyle w:val="BodyText"/>
+      </w:pPr>
+      <w:r>
+        <w:rPr>
+          <w:bCs/>
+          <w:b/>
+        </w:rPr>
+        <w:t xml:space="preserve">Want to work ahead?</w:t>
+      </w:r>
+      <w:r>
+        <w:t xml:space="preserve"> </w:t>
+      </w:r>
+      <w:r>
+        <w:t xml:space="preserve">Message me on Slack, and I’ll unlock material early. This is especially worth doing if you’re also working through CS50P and wanting to earn the CS50 certificate.</w:t>
+      </w:r>
+    </w:p>
     <w:bookmarkEnd w:id="30"/>
-    <w:bookmarkStart w:id="31" w:name="how-we-spend-our-time"/>
-    <w:p>
-      <w:pPr>
-        <w:pStyle w:val="Heading2"/>
-      </w:pPr>
-      <w:r>
-        <w:t xml:space="preserve">How we spend our time</w:t>
-      </w:r>
-    </w:p>
-    <w:p>
-      <w:pPr>
-        <w:pStyle w:val="FirstParagraph"/>
-      </w:pPr>
-      <w:r>
-        <w:t xml:space="preserve">We’ll use lectures, videos, group activities, hands-on labs, peer critiques, and discussion. You’re expected to take part in class discussions and exercises, and I’d love it if you brought your own real-world examples into them.</w:t>
-      </w:r>
-    </w:p>
-    <w:p>
-      <w:pPr>
-        <w:pStyle w:val="BodyText"/>
-      </w:pPr>
-      <w:r>
-        <w:t xml:space="preserve">Each week you’ll work through a Canvas module: readings, videos, labs, a problem set, and a collaborative assignment. Most weeks also open with a short in-class quiz on the module you just finished — eight across the quarter, on the dates in the schedule. Modules open on Sundays, except Modules 0 and 1, which open on the first day of class.</w:t>
-      </w:r>
-    </w:p>
-    <w:p>
-      <w:pPr>
-        <w:pStyle w:val="BodyText"/>
-      </w:pPr>
-      <w:r>
-        <w:rPr>
-          <w:bCs/>
-          <w:b/>
-        </w:rPr>
-        <w:t xml:space="preserve">Want to work ahead?</w:t>
-      </w:r>
-      <w:r>
-        <w:t xml:space="preserve"> </w:t>
-      </w:r>
-      <w:r>
-        <w:t xml:space="preserve">Message me on Slack, and I’ll unlock material early. This is especially worth doing if you’re also working through CS50P and wanting to earn the CS50 certificate.</w:t>
-      </w:r>
-    </w:p>
-    <w:bookmarkEnd w:id="31"/>
-    <w:bookmarkStart w:id="32" w:name="attendance"/>
+    <w:bookmarkStart w:id="31" w:name="attendance"/>
     <w:p>
       <w:pPr>
         <w:pStyle w:val="Heading2"/>
@@ -1997,8 +2032,8 @@
         <w:t xml:space="preserve">Absences for reasons of faith or conscience are accommodated. See Student rights.</w:t>
       </w:r>
     </w:p>
-    <w:bookmarkEnd w:id="32"/>
-    <w:bookmarkStart w:id="34" w:name="if-you-need-an-accommodation"/>
+    <w:bookmarkEnd w:id="31"/>
+    <w:bookmarkStart w:id="33" w:name="if-you-need-an-accommodation"/>
     <w:p>
       <w:pPr>
         <w:pStyle w:val="Heading2"/>
@@ -2017,7 +2052,7 @@
       <w:r>
         <w:t xml:space="preserve"> </w:t>
       </w:r>
-      <w:hyperlink r:id="rId33">
+      <w:hyperlink r:id="rId32">
         <w:r>
           <w:rPr>
             <w:rStyle w:val="Hyperlink"/>
@@ -2039,9 +2074,9 @@
         </w:pict>
       </w:r>
     </w:p>
+    <w:bookmarkEnd w:id="33"/>
     <w:bookmarkEnd w:id="34"/>
-    <w:bookmarkEnd w:id="35"/>
-    <w:bookmarkStart w:id="39" w:name="what-youll-need"/>
+    <w:bookmarkStart w:id="38" w:name="what-youll-need"/>
     <w:p>
       <w:pPr>
         <w:pStyle w:val="Heading1"/>
@@ -2146,7 +2181,7 @@
               <w:pStyle w:val="Compact"/>
               <w:jc w:val="left"/>
             </w:pPr>
-            <w:hyperlink r:id="rId23">
+            <w:hyperlink r:id="rId22">
               <w:r>
                 <w:rPr>
                   <w:rStyle w:val="Hyperlink"/>
@@ -2345,19 +2380,8 @@
               <w:pStyle w:val="Compact"/>
               <w:jc w:val="left"/>
             </w:pPr>
-            <w:hyperlink r:id="rId22">
-              <w:r>
-                <w:rPr>
-                  <w:rStyle w:val="Hyperlink"/>
-                </w:rPr>
-                <w:t xml:space="preserve">cs50.ai</w:t>
-              </w:r>
-            </w:hyperlink>
-            <w:r>
-              <w:t xml:space="preserve"> </w:t>
-            </w:r>
-            <w:r>
-              <w:t xml:space="preserve">— your approved AI helper.</w:t>
+            <w:r>
+              <w:t xml:space="preserve">Your approved AI helper. Built into cs50.dev — nothing to install or sign up for.</w:t>
             </w:r>
           </w:p>
         </w:tc>
@@ -2370,7 +2394,7 @@
       <w:r>
         <w:t xml:space="preserve">You’ll also need to be comfortable using Canvas (</w:t>
       </w:r>
-      <w:hyperlink r:id="rId36">
+      <w:hyperlink r:id="rId35">
         <w:r>
           <w:rPr>
             <w:rStyle w:val="Hyperlink"/>
@@ -2397,7 +2421,7 @@
         <w:t xml:space="preserve"> </w:t>
       </w:r>
       <w:r>
-        <w:t xml:space="preserve">Slack, GitHub, and cs50.ai are run by companies other than Clark, so a few things are worth knowing:</w:t>
+        <w:t xml:space="preserve">Slack, GitHub, and cs50.dev are run by companies other than Clark, so a few things are worth knowing:</w:t>
       </w:r>
     </w:p>
     <w:p>
@@ -2468,7 +2492,7 @@
       <w:r>
         <w:t xml:space="preserve"> </w:t>
       </w:r>
-      <w:hyperlink r:id="rId37">
+      <w:hyperlink r:id="rId36">
         <w:r>
           <w:rPr>
             <w:rStyle w:val="Hyperlink"/>
@@ -2482,7 +2506,7 @@
       <w:r>
         <w:t xml:space="preserve"> </w:t>
       </w:r>
-      <w:hyperlink r:id="rId38">
+      <w:hyperlink r:id="rId37">
         <w:r>
           <w:rPr>
             <w:rStyle w:val="Hyperlink"/>
@@ -2504,8 +2528,8 @@
         </w:pict>
       </w:r>
     </w:p>
-    <w:bookmarkEnd w:id="39"/>
-    <w:bookmarkStart w:id="46" w:name="how-youll-be-graded"/>
+    <w:bookmarkEnd w:id="38"/>
+    <w:bookmarkStart w:id="45" w:name="how-youll-be-graded"/>
     <w:p>
       <w:pPr>
         <w:pStyle w:val="Heading1"/>
@@ -2514,7 +2538,7 @@
         <w:t xml:space="preserve">How you’ll be graded</w:t>
       </w:r>
     </w:p>
-    <w:bookmarkStart w:id="40" w:name="where-your-grade-comes-from"/>
+    <w:bookmarkStart w:id="39" w:name="where-your-grade-comes-from"/>
     <w:p>
       <w:pPr>
         <w:pStyle w:val="Heading2"/>
@@ -2918,8 +2942,8 @@
         <w:t xml:space="preserve">. Two things sit outside it: anything taken in class, and the final project.</w:t>
       </w:r>
     </w:p>
-    <w:bookmarkEnd w:id="40"/>
-    <w:bookmarkStart w:id="41" w:name="the-details"/>
+    <w:bookmarkEnd w:id="39"/>
+    <w:bookmarkStart w:id="40" w:name="the-details"/>
     <w:p>
       <w:pPr>
         <w:pStyle w:val="Heading2"/>
@@ -3489,8 +3513,8 @@
         <w:t xml:space="preserve">Rubrics for every assessment live in the relevant Canvas module.</w:t>
       </w:r>
     </w:p>
-    <w:bookmarkEnd w:id="41"/>
-    <w:bookmarkStart w:id="42" w:name="how-participation-works"/>
+    <w:bookmarkEnd w:id="40"/>
+    <w:bookmarkStart w:id="41" w:name="how-participation-works"/>
     <w:p>
       <w:pPr>
         <w:pStyle w:val="Heading2"/>
@@ -3704,8 +3728,8 @@
         <w:t xml:space="preserve">— including as part of a DAC accommodation — tell me in the first two weeks, or as soon as the need comes up. There’s a written alternative for every in-class component. Setting it up is routine and completely unremarkable.</w:t>
       </w:r>
     </w:p>
-    <w:bookmarkEnd w:id="42"/>
-    <w:bookmarkStart w:id="43" w:name="grading-scale"/>
+    <w:bookmarkEnd w:id="41"/>
+    <w:bookmarkStart w:id="42" w:name="grading-scale"/>
     <w:p>
       <w:pPr>
         <w:pStyle w:val="Heading2"/>
@@ -4131,8 +4155,8 @@
         <w:t xml:space="preserve">is possible only if you’ve completed most of the course in good standing and something unexpected stops you from finishing. It takes a written agreement between us with a deadline, and it isn’t a substitute for withdrawing.</w:t>
       </w:r>
     </w:p>
-    <w:bookmarkEnd w:id="43"/>
-    <w:bookmarkStart w:id="44" w:name="late-work"/>
+    <w:bookmarkEnd w:id="42"/>
+    <w:bookmarkStart w:id="43" w:name="late-work"/>
     <w:p>
       <w:pPr>
         <w:pStyle w:val="Heading2"/>
@@ -4318,8 +4342,8 @@
         <w:t xml:space="preserve">Work that lands weeks or months late has lost most of its value, because it no longer connects to anything the class is doing. That’s the reason for the window, and it’s why talking to me early works so much better than going quiet.</w:t>
       </w:r>
     </w:p>
-    <w:bookmarkEnd w:id="44"/>
-    <w:bookmarkStart w:id="45" w:name="feedback"/>
+    <w:bookmarkEnd w:id="43"/>
+    <w:bookmarkStart w:id="44" w:name="feedback"/>
     <w:p>
       <w:pPr>
         <w:pStyle w:val="Heading2"/>
@@ -4343,9 +4367,9 @@
         </w:pict>
       </w:r>
     </w:p>
+    <w:bookmarkEnd w:id="44"/>
     <w:bookmarkEnd w:id="45"/>
-    <w:bookmarkEnd w:id="46"/>
-    <w:bookmarkStart w:id="47" w:name="weekly-schedule"/>
+    <w:bookmarkStart w:id="46" w:name="weekly-schedule"/>
     <w:p>
       <w:pPr>
         <w:pStyle w:val="Heading1"/>
@@ -5373,53 +5397,53 @@
         </w:pict>
       </w:r>
     </w:p>
+    <w:bookmarkEnd w:id="46"/>
+    <w:bookmarkStart w:id="56" w:name="course-agreements"/>
+    <w:p>
+      <w:pPr>
+        <w:pStyle w:val="Heading1"/>
+      </w:pPr>
+      <w:r>
+        <w:t xml:space="preserve">Course agreements</w:t>
+      </w:r>
+    </w:p>
+    <w:bookmarkStart w:id="47" w:name="communication"/>
+    <w:p>
+      <w:pPr>
+        <w:pStyle w:val="Heading2"/>
+      </w:pPr>
+      <w:r>
+        <w:t xml:space="preserve">Communication</w:t>
+      </w:r>
+    </w:p>
+    <w:p>
+      <w:pPr>
+        <w:pStyle w:val="FirstParagraph"/>
+      </w:pPr>
+      <w:r>
+        <w:rPr>
+          <w:bCs/>
+          <w:b/>
+        </w:rPr>
+        <w:t xml:space="preserve">Slack is the fastest way to reach me,</w:t>
+      </w:r>
+      <w:r>
+        <w:t xml:space="preserve"> </w:t>
+      </w:r>
+      <w:r>
+        <w:t xml:space="preserve">and it’s where you can ask questions, help each other, and share things you find. Everyone gets an invitation; if yours didn’t arrive, contact me. Check Canvas announcements whenever you log in — they’re at the top of the page.</w:t>
+      </w:r>
+    </w:p>
+    <w:p>
+      <w:pPr>
+        <w:pStyle w:val="BodyText"/>
+      </w:pPr>
+      <w:r>
+        <w:t xml:space="preserve">On netiquette: there are real people on the other side of every message. Use the same courtesy online that you’d use face-to-face.</w:t>
+      </w:r>
+    </w:p>
     <w:bookmarkEnd w:id="47"/>
-    <w:bookmarkStart w:id="57" w:name="course-agreements"/>
-    <w:p>
-      <w:pPr>
-        <w:pStyle w:val="Heading1"/>
-      </w:pPr>
-      <w:r>
-        <w:t xml:space="preserve">Course agreements</w:t>
-      </w:r>
-    </w:p>
-    <w:bookmarkStart w:id="48" w:name="communication"/>
-    <w:p>
-      <w:pPr>
-        <w:pStyle w:val="Heading2"/>
-      </w:pPr>
-      <w:r>
-        <w:t xml:space="preserve">Communication</w:t>
-      </w:r>
-    </w:p>
-    <w:p>
-      <w:pPr>
-        <w:pStyle w:val="FirstParagraph"/>
-      </w:pPr>
-      <w:r>
-        <w:rPr>
-          <w:bCs/>
-          <w:b/>
-        </w:rPr>
-        <w:t xml:space="preserve">Slack is the fastest way to reach me,</w:t>
-      </w:r>
-      <w:r>
-        <w:t xml:space="preserve"> </w:t>
-      </w:r>
-      <w:r>
-        <w:t xml:space="preserve">and it’s where you can ask questions, help each other, and share things you find. Everyone gets an invitation; if yours didn’t arrive, contact me. Check Canvas announcements whenever you log in — they’re at the top of the page.</w:t>
-      </w:r>
-    </w:p>
-    <w:p>
-      <w:pPr>
-        <w:pStyle w:val="BodyText"/>
-      </w:pPr>
-      <w:r>
-        <w:t xml:space="preserve">On netiquette: there are real people on the other side of every message. Use the same courtesy online that you’d use face-to-face.</w:t>
-      </w:r>
-    </w:p>
-    <w:bookmarkEnd w:id="48"/>
-    <w:bookmarkStart w:id="49" w:name="ai-guidelines"/>
+    <w:bookmarkStart w:id="48" w:name="ai-guidelines"/>
     <w:p>
       <w:pPr>
         <w:pStyle w:val="Heading2"/>
@@ -5516,21 +5540,7 @@
               <w:t xml:space="preserve">CS50 Duck Debugger</w:t>
             </w:r>
             <w:r>
-              <w:t xml:space="preserve"> </w:t>
-            </w:r>
-            <w:r>
-              <w:t xml:space="preserve">(</w:t>
-            </w:r>
-            <w:hyperlink r:id="rId22">
-              <w:r>
-                <w:rPr>
-                  <w:rStyle w:val="Hyperlink"/>
-                </w:rPr>
-                <w:t xml:space="preserve">cs50.ai</w:t>
-              </w:r>
-            </w:hyperlink>
-            <w:r>
-              <w:t xml:space="preserve">). It’s built to ask you questions rather than hand you answers. That’s the point.</w:t>
+              <w:t xml:space="preserve">, built into cs50.dev. It’s built to ask you questions rather than hand you answers. That’s the point.</w:t>
             </w:r>
           </w:p>
         </w:tc>
@@ -5635,7 +5645,7 @@
               <w:pStyle w:val="Compact"/>
               <w:jc w:val="left"/>
             </w:pPr>
-            <w:hyperlink r:id="rId23">
+            <w:hyperlink r:id="rId22">
               <w:r>
                 <w:rPr>
                   <w:rStyle w:val="Hyperlink"/>
@@ -5736,8 +5746,8 @@
         <w:t xml:space="preserve">Asking has never once counted against a student.</w:t>
       </w:r>
     </w:p>
-    <w:bookmarkEnd w:id="49"/>
-    <w:bookmarkStart w:id="51" w:name="academic-honesty"/>
+    <w:bookmarkEnd w:id="48"/>
+    <w:bookmarkStart w:id="50" w:name="academic-honesty"/>
     <w:p>
       <w:pPr>
         <w:pStyle w:val="Heading2"/>
@@ -6222,7 +6232,7 @@
       <w:r>
         <w:t xml:space="preserve"> </w:t>
       </w:r>
-      <w:hyperlink r:id="rId50">
+      <w:hyperlink r:id="rId49">
         <w:r>
           <w:rPr>
             <w:rStyle w:val="Hyperlink"/>
@@ -6264,23 +6274,13 @@
           <w:bCs/>
           <w:b/>
         </w:rPr>
-        <w:t xml:space="preserve">When in doubt, ask me first — in writing, so we both have the answer.</w:t>
-      </w:r>
-      <w:r>
-        <w:t xml:space="preserve"> </w:t>
-      </w:r>
-      <w:r>
-        <w:t xml:space="preserve">Asking in good faith never counts against you.</w:t>
-      </w:r>
-    </w:p>
-    <w:bookmarkEnd w:id="51"/>
-    <w:bookmarkStart w:id="52" w:name="classroom-norms"/>
-    <w:p>
-      <w:pPr>
-        <w:pStyle w:val="Heading2"/>
-      </w:pPr>
-      <w:r>
-        <w:t xml:space="preserve">Classroom norms</w:t>
+        <w:t xml:space="preserve">The Regret Clause.</w:t>
+      </w:r>
+      <w:r>
+        <w:t xml:space="preserve"> </w:t>
+      </w:r>
+      <w:r>
+        <w:t xml:space="preserve">If you cross that line and tell me, it costs you nothing — once. Name the assignment, say what you did, and there is no penalty and no referral. We sort it out and move on.</w:t>
       </w:r>
     </w:p>
     <w:p>
@@ -6292,7 +6292,20 @@
         <w:pStyle w:val="Compact"/>
       </w:pPr>
       <w:r>
-        <w:t xml:space="preserve">Complete each week’s module — readings, assignments, and discussions — by the due date.</w:t>
+        <w:t xml:space="preserve">It works</w:t>
+      </w:r>
+      <w:r>
+        <w:t xml:space="preserve"> </w:t>
+      </w:r>
+      <w:r>
+        <w:rPr>
+          <w:bCs/>
+          <w:b/>
+        </w:rPr>
+        <w:t xml:space="preserve">one time</w:t>
+      </w:r>
+      <w:r>
+        <w:t xml:space="preserve">, for the whole quarter.</w:t>
       </w:r>
     </w:p>
     <w:p>
@@ -6304,7 +6317,23 @@
         <w:pStyle w:val="Compact"/>
       </w:pPr>
       <w:r>
-        <w:t xml:space="preserve">Take part in class discussions and exercises, and bring your own experiences into them.</w:t>
+        <w:t xml:space="preserve">Use it</w:t>
+      </w:r>
+      <w:r>
+        <w:t xml:space="preserve"> </w:t>
+      </w:r>
+      <w:r>
+        <w:rPr>
+          <w:bCs/>
+          <w:b/>
+        </w:rPr>
+        <w:t xml:space="preserve">before I have noticed, or after I have asked you about a piece of work.</w:t>
+      </w:r>
+      <w:r>
+        <w:t xml:space="preserve"> </w:t>
+      </w:r>
+      <w:r>
+        <w:t xml:space="preserve">Either way counts.</w:t>
       </w:r>
     </w:p>
     <w:p>
@@ -6316,7 +6345,23 @@
         <w:pStyle w:val="Compact"/>
       </w:pPr>
       <w:r>
-        <w:t xml:space="preserve">Be a courteous member of the room and don’t get in the way of anyone else’s learning.</w:t>
+        <w:t xml:space="preserve">It covers</w:t>
+      </w:r>
+      <w:r>
+        <w:t xml:space="preserve"> </w:t>
+      </w:r>
+      <w:r>
+        <w:rPr>
+          <w:bCs/>
+          <w:b/>
+        </w:rPr>
+        <w:t xml:space="preserve">academic honesty</w:t>
+      </w:r>
+      <w:r>
+        <w:t xml:space="preserve"> </w:t>
+      </w:r>
+      <w:r>
+        <w:t xml:space="preserve">— the AI rule, plagiarism, collaboration that went further than it should have.</w:t>
       </w:r>
     </w:p>
     <w:p>
@@ -6328,29 +6373,141 @@
         <w:pStyle w:val="Compact"/>
       </w:pPr>
       <w:r>
-        <w:t xml:space="preserve">Academic and intellectual honesty are expected at all times.</w:t>
+        <w:t xml:space="preserve">To use it, message me on Slack or email me with the assignment name and what happened.</w:t>
+      </w:r>
+    </w:p>
+    <w:p>
+      <w:pPr>
+        <w:pStyle w:val="FirstParagraph"/>
+      </w:pPr>
+      <w:r>
+        <w:t xml:space="preserve">People make bad calls at 2 AM in a week that got away from them. That should not decide your quarter, and I would far rather hear it from you than find it myself. There is only one, so use it when it counts.</w:t>
+      </w:r>
+    </w:p>
+    <w:p>
+      <w:pPr>
+        <w:pStyle w:val="BodyText"/>
+      </w:pPr>
+      <w:r>
+        <w:rPr>
+          <w:bCs/>
+          <w:b/>
+        </w:rPr>
+        <w:t xml:space="preserve">When in doubt, ask me first — in writing, so we both have the answer.</w:t>
+      </w:r>
+      <w:r>
+        <w:t xml:space="preserve"> </w:t>
+      </w:r>
+      <w:r>
+        <w:t xml:space="preserve">Asking in good faith never counts against you.</w:t>
+      </w:r>
+    </w:p>
+    <w:bookmarkEnd w:id="50"/>
+    <w:bookmarkStart w:id="51" w:name="classroom-norms"/>
+    <w:p>
+      <w:pPr>
+        <w:pStyle w:val="Heading2"/>
+      </w:pPr>
+      <w:r>
+        <w:t xml:space="preserve">Classroom norms</w:t>
       </w:r>
     </w:p>
     <w:p>
       <w:pPr>
         <w:numPr>
           <w:ilvl w:val="0"/>
-          <w:numId w:val="1013"/>
+          <w:numId w:val="1014"/>
         </w:numPr>
         <w:pStyle w:val="Compact"/>
       </w:pPr>
       <w:r>
+        <w:t xml:space="preserve">Complete each week’s module — readings, assignments, and discussions — by the due date.</w:t>
+      </w:r>
+    </w:p>
+    <w:p>
+      <w:pPr>
+        <w:numPr>
+          <w:ilvl w:val="0"/>
+          <w:numId w:val="1014"/>
+        </w:numPr>
+        <w:pStyle w:val="Compact"/>
+      </w:pPr>
+      <w:r>
+        <w:t xml:space="preserve">Take part in class discussions and exercises, and bring your own experiences into them.</w:t>
+      </w:r>
+    </w:p>
+    <w:p>
+      <w:pPr>
+        <w:numPr>
+          <w:ilvl w:val="0"/>
+          <w:numId w:val="1014"/>
+        </w:numPr>
+        <w:pStyle w:val="Compact"/>
+      </w:pPr>
+      <w:r>
+        <w:t xml:space="preserve">Be a courteous member of the room and don’t get in the way of anyone else’s learning.</w:t>
+      </w:r>
+    </w:p>
+    <w:p>
+      <w:pPr>
+        <w:numPr>
+          <w:ilvl w:val="0"/>
+          <w:numId w:val="1014"/>
+        </w:numPr>
+        <w:pStyle w:val="Compact"/>
+      </w:pPr>
+      <w:r>
+        <w:t xml:space="preserve">Academic and intellectual honesty are expected at all times.</w:t>
+      </w:r>
+    </w:p>
+    <w:p>
+      <w:pPr>
+        <w:numPr>
+          <w:ilvl w:val="0"/>
+          <w:numId w:val="1014"/>
+        </w:numPr>
+        <w:pStyle w:val="Compact"/>
+      </w:pPr>
+      <w:r>
         <w:t xml:space="preserve">Tell me as early as you can about anything that affects your ability to take part fully.</w:t>
       </w:r>
     </w:p>
+    <w:bookmarkEnd w:id="51"/>
+    <w:bookmarkStart w:id="52" w:name="recording-class-sessions"/>
+    <w:p>
+      <w:pPr>
+        <w:pStyle w:val="Heading2"/>
+      </w:pPr>
+      <w:r>
+        <w:t xml:space="preserve">Recording class sessions</w:t>
+      </w:r>
+    </w:p>
+    <w:p>
+      <w:pPr>
+        <w:pStyle w:val="FirstParagraph"/>
+      </w:pPr>
+      <w:r>
+        <w:rPr>
+          <w:bCs/>
+          <w:b/>
+        </w:rPr>
+        <w:t xml:space="preserve">You’re welcome to record class for your own study use</w:t>
+      </w:r>
+      <w:r>
+        <w:t xml:space="preserve"> </w:t>
+      </w:r>
+      <w:r>
+        <w:t xml:space="preserve">— no permission needed. Please don’t post or share recordings, screenshots, or classmates’ work outside this class. People share half-finished code and honest confusion in a programming class, and that only works if the room feels safe. If DAC has approved recording as an accommodation, you never need to explain that to anyone. If I record a session, I’ll say so and post it in Canvas.</w:t>
+      </w:r>
+    </w:p>
     <w:bookmarkEnd w:id="52"/>
-    <w:bookmarkStart w:id="53" w:name="recording-class-sessions"/>
+    <w:bookmarkStart w:id="53" w:name="changes-to-this-syllabus"/>
     <w:p>
       <w:pPr>
         <w:pStyle w:val="Heading2"/>
       </w:pPr>
       <w:r>
-        <w:t xml:space="preserve">Recording class sessions</w:t>
+        <w:t xml:space="preserve">Changes to this syllabus</w:t>
       </w:r>
     </w:p>
     <w:p>
@@ -6358,27 +6515,17 @@
         <w:pStyle w:val="FirstParagraph"/>
       </w:pPr>
       <w:r>
-        <w:rPr>
-          <w:bCs/>
-          <w:b/>
-        </w:rPr>
-        <w:t xml:space="preserve">You’re welcome to record class for your own study use</w:t>
-      </w:r>
-      <w:r>
-        <w:t xml:space="preserve"> </w:t>
-      </w:r>
-      <w:r>
-        <w:t xml:space="preserve">— no permission needed. Please don’t post or share recordings, screenshots, or classmates’ work outside this class. People share half-finished code and honest confusion in a programming class, and that only works if the room feels safe. If DAC has approved recording as an accommodation, you never need to explain that to anyone. If I record a session, I’ll say so and post it in Canvas.</w:t>
+        <w:t xml:space="preserve">This is a plan, not a contract, and I may adjust it during the quarter. Anything that affects your grade or deadlines is announced on Canvas and Slack, and I’ll post an updated syllabus.</w:t>
       </w:r>
     </w:p>
     <w:bookmarkEnd w:id="53"/>
-    <w:bookmarkStart w:id="54" w:name="changes-to-this-syllabus"/>
+    <w:bookmarkStart w:id="55" w:name="withdrawing-from-the-course"/>
     <w:p>
       <w:pPr>
         <w:pStyle w:val="Heading2"/>
       </w:pPr>
       <w:r>
-        <w:t xml:space="preserve">Changes to this syllabus</w:t>
+        <w:t xml:space="preserve">Withdrawing from the course</w:t>
       </w:r>
     </w:p>
     <w:p>
@@ -6386,24 +6533,6 @@
         <w:pStyle w:val="FirstParagraph"/>
       </w:pPr>
       <w:r>
-        <w:t xml:space="preserve">This is a plan, not a contract, and I may adjust it during the quarter. Anything that affects your grade or deadlines is announced on Canvas and Slack, and I’ll post an updated syllabus.</w:t>
-      </w:r>
-    </w:p>
-    <w:bookmarkEnd w:id="54"/>
-    <w:bookmarkStart w:id="56" w:name="withdrawing-from-the-course"/>
-    <w:p>
-      <w:pPr>
-        <w:pStyle w:val="Heading2"/>
-      </w:pPr>
-      <w:r>
-        <w:t xml:space="preserve">Withdrawing from the course</w:t>
-      </w:r>
-    </w:p>
-    <w:p>
-      <w:pPr>
-        <w:pStyle w:val="FirstParagraph"/>
-      </w:pPr>
-      <w:r>
         <w:t xml:space="preserve">The last day to withdraw is</w:t>
       </w:r>
       <w:r>
@@ -6440,7 +6569,7 @@
       <w:r>
         <w:t xml:space="preserve"> </w:t>
       </w:r>
-      <w:hyperlink r:id="rId55">
+      <w:hyperlink r:id="rId54">
         <w:r>
           <w:rPr>
             <w:rStyle w:val="Hyperlink"/>
@@ -6480,9 +6609,9 @@
         </w:pict>
       </w:r>
     </w:p>
+    <w:bookmarkEnd w:id="55"/>
     <w:bookmarkEnd w:id="56"/>
-    <w:bookmarkEnd w:id="57"/>
-    <w:bookmarkStart w:id="58" w:name="what-youll-be-able-to-do-by-the-end"/>
+    <w:bookmarkStart w:id="57" w:name="what-youll-be-able-to-do-by-the-end"/>
     <w:p>
       <w:pPr>
         <w:pStyle w:val="Heading1"/>
@@ -6503,7 +6632,7 @@
       <w:pPr>
         <w:numPr>
           <w:ilvl w:val="0"/>
-          <w:numId w:val="1014"/>
+          <w:numId w:val="1015"/>
         </w:numPr>
         <w:pStyle w:val="Compact"/>
       </w:pPr>
@@ -6525,7 +6654,7 @@
       <w:pPr>
         <w:numPr>
           <w:ilvl w:val="0"/>
-          <w:numId w:val="1014"/>
+          <w:numId w:val="1015"/>
         </w:numPr>
         <w:pStyle w:val="Compact"/>
       </w:pPr>
@@ -6547,7 +6676,7 @@
       <w:pPr>
         <w:numPr>
           <w:ilvl w:val="0"/>
-          <w:numId w:val="1014"/>
+          <w:numId w:val="1015"/>
         </w:numPr>
         <w:pStyle w:val="Compact"/>
       </w:pPr>
@@ -6569,7 +6698,7 @@
       <w:pPr>
         <w:numPr>
           <w:ilvl w:val="0"/>
-          <w:numId w:val="1014"/>
+          <w:numId w:val="1015"/>
         </w:numPr>
         <w:pStyle w:val="Compact"/>
       </w:pPr>
@@ -7011,8 +7140,8 @@
         </w:pict>
       </w:r>
     </w:p>
-    <w:bookmarkEnd w:id="58"/>
-    <w:bookmarkStart w:id="78" w:name="college-policies"/>
+    <w:bookmarkEnd w:id="57"/>
+    <w:bookmarkStart w:id="77" w:name="college-policies"/>
     <w:p>
       <w:pPr>
         <w:pStyle w:val="Heading1"/>
@@ -7021,7 +7150,7 @@
         <w:t xml:space="preserve">College policies</w:t>
       </w:r>
     </w:p>
-    <w:bookmarkStart w:id="63" w:name="ada-accommodations"/>
+    <w:bookmarkStart w:id="62" w:name="ada-accommodations"/>
     <w:p>
       <w:pPr>
         <w:pStyle w:val="Heading2"/>
@@ -7056,7 +7185,7 @@
       <w:r>
         <w:t xml:space="preserve"> </w:t>
       </w:r>
-      <w:hyperlink r:id="rId59">
+      <w:hyperlink r:id="rId58">
         <w:r>
           <w:rPr>
             <w:rStyle w:val="Hyperlink"/>
@@ -7133,7 +7262,7 @@
               <w:pStyle w:val="Compact"/>
               <w:jc w:val="left"/>
             </w:pPr>
-            <w:hyperlink r:id="rId60">
+            <w:hyperlink r:id="rId59">
               <w:r>
                 <w:rPr>
                   <w:rStyle w:val="Hyperlink"/>
@@ -7150,7 +7279,7 @@
             <w:r>
               <w:t xml:space="preserve"> </w:t>
             </w:r>
-            <w:hyperlink r:id="rId61">
+            <w:hyperlink r:id="rId60">
               <w:r>
                 <w:rPr>
                   <w:rStyle w:val="Hyperlink"/>
@@ -7218,7 +7347,7 @@
       <w:r>
         <w:t xml:space="preserve"> </w:t>
       </w:r>
-      <w:hyperlink r:id="rId62">
+      <w:hyperlink r:id="rId61">
         <w:r>
           <w:rPr>
             <w:rStyle w:val="Hyperlink"/>
@@ -7254,8 +7383,8 @@
         <w:t xml:space="preserve">Once your accommodations are set, contact me so we can talk about this course specifically. If you have any emergency medical information I should know about, tell me by the end of week one.</w:t>
       </w:r>
     </w:p>
-    <w:bookmarkEnd w:id="63"/>
-    <w:bookmarkStart w:id="65" w:name="non-discrimination"/>
+    <w:bookmarkEnd w:id="62"/>
+    <w:bookmarkStart w:id="64" w:name="non-discrimination"/>
     <w:p>
       <w:pPr>
         <w:pStyle w:val="Heading2"/>
@@ -7282,7 +7411,7 @@
       <w:r>
         <w:t xml:space="preserve"> </w:t>
       </w:r>
-      <w:hyperlink r:id="rId64">
+      <w:hyperlink r:id="rId63">
         <w:r>
           <w:rPr>
             <w:rStyle w:val="Hyperlink"/>
@@ -7294,8 +7423,8 @@
         <w:t xml:space="preserve">.</w:t>
       </w:r>
     </w:p>
-    <w:bookmarkEnd w:id="65"/>
-    <w:bookmarkStart w:id="71" w:name="title-ix-and-sexual-misconduct"/>
+    <w:bookmarkEnd w:id="64"/>
+    <w:bookmarkStart w:id="70" w:name="title-ix-and-sexual-misconduct"/>
     <w:p>
       <w:pPr>
         <w:pStyle w:val="Heading2"/>
@@ -7334,11 +7463,11 @@
       <w:pPr>
         <w:numPr>
           <w:ilvl w:val="0"/>
-          <w:numId w:val="1015"/>
+          <w:numId w:val="1016"/>
         </w:numPr>
         <w:pStyle w:val="Compact"/>
       </w:pPr>
-      <w:hyperlink r:id="rId66">
+      <w:hyperlink r:id="rId65">
         <w:r>
           <w:rPr>
             <w:rStyle w:val="Hyperlink"/>
@@ -7351,11 +7480,11 @@
       <w:pPr>
         <w:numPr>
           <w:ilvl w:val="0"/>
-          <w:numId w:val="1015"/>
+          <w:numId w:val="1016"/>
         </w:numPr>
         <w:pStyle w:val="Compact"/>
       </w:pPr>
-      <w:hyperlink r:id="rId67">
+      <w:hyperlink r:id="rId66">
         <w:r>
           <w:rPr>
             <w:rStyle w:val="Hyperlink"/>
@@ -7368,11 +7497,11 @@
       <w:pPr>
         <w:numPr>
           <w:ilvl w:val="0"/>
-          <w:numId w:val="1015"/>
+          <w:numId w:val="1016"/>
         </w:numPr>
         <w:pStyle w:val="Compact"/>
       </w:pPr>
-      <w:hyperlink r:id="rId68">
+      <w:hyperlink r:id="rId67">
         <w:r>
           <w:rPr>
             <w:rStyle w:val="Hyperlink"/>
@@ -7385,11 +7514,11 @@
       <w:pPr>
         <w:numPr>
           <w:ilvl w:val="0"/>
-          <w:numId w:val="1015"/>
+          <w:numId w:val="1016"/>
         </w:numPr>
         <w:pStyle w:val="Compact"/>
       </w:pPr>
-      <w:hyperlink r:id="rId69">
+      <w:hyperlink r:id="rId68">
         <w:r>
           <w:rPr>
             <w:rStyle w:val="Hyperlink"/>
@@ -7402,11 +7531,11 @@
       <w:pPr>
         <w:numPr>
           <w:ilvl w:val="0"/>
-          <w:numId w:val="1015"/>
+          <w:numId w:val="1016"/>
         </w:numPr>
         <w:pStyle w:val="Compact"/>
       </w:pPr>
-      <w:hyperlink r:id="rId70">
+      <w:hyperlink r:id="rId69">
         <w:r>
           <w:rPr>
             <w:rStyle w:val="Hyperlink"/>
@@ -7415,8 +7544,8 @@
         </w:r>
       </w:hyperlink>
     </w:p>
-    <w:bookmarkEnd w:id="71"/>
-    <w:bookmarkStart w:id="73" w:name="student-rights-and-responsibilities"/>
+    <w:bookmarkEnd w:id="70"/>
+    <w:bookmarkStart w:id="72" w:name="student-rights-and-responsibilities"/>
     <w:p>
       <w:pPr>
         <w:pStyle w:val="Heading2"/>
@@ -7435,7 +7564,7 @@
       <w:r>
         <w:t xml:space="preserve"> </w:t>
       </w:r>
-      <w:hyperlink r:id="rId72">
+      <w:hyperlink r:id="rId71">
         <w:r>
           <w:rPr>
             <w:rStyle w:val="Hyperlink"/>
@@ -7466,8 +7595,8 @@
         <w:t xml:space="preserve">— no explanation needed beyond that.</w:t>
       </w:r>
     </w:p>
-    <w:bookmarkEnd w:id="73"/>
-    <w:bookmarkStart w:id="74" w:name="academic-dishonesty"/>
+    <w:bookmarkEnd w:id="72"/>
+    <w:bookmarkStart w:id="73" w:name="academic-dishonesty"/>
     <w:p>
       <w:pPr>
         <w:pStyle w:val="Heading2"/>
@@ -7488,7 +7617,7 @@
       <w:pPr>
         <w:numPr>
           <w:ilvl w:val="0"/>
-          <w:numId w:val="1016"/>
+          <w:numId w:val="1017"/>
         </w:numPr>
         <w:pStyle w:val="Compact"/>
       </w:pPr>
@@ -7510,7 +7639,7 @@
       <w:pPr>
         <w:numPr>
           <w:ilvl w:val="0"/>
-          <w:numId w:val="1016"/>
+          <w:numId w:val="1017"/>
         </w:numPr>
         <w:pStyle w:val="Compact"/>
       </w:pPr>
@@ -7564,8 +7693,8 @@
         <w:t xml:space="preserve">a failing grade on the assignment or, in extreme cases, the course. Students may also be referred to the Student Conduct Office, which can require learning activities or, in extreme or repeated cases, dismissal from a program. To challenge a finding, you can file a grade appeal starting with the division chair.</w:t>
       </w:r>
     </w:p>
-    <w:bookmarkEnd w:id="74"/>
-    <w:bookmarkStart w:id="77" w:name="emergencies"/>
+    <w:bookmarkEnd w:id="73"/>
+    <w:bookmarkStart w:id="76" w:name="emergencies"/>
     <w:p>
       <w:pPr>
         <w:pStyle w:val="Heading2"/>
@@ -7644,7 +7773,7 @@
             <w:r>
               <w:t xml:space="preserve"> </w:t>
             </w:r>
-            <w:hyperlink r:id="rId75">
+            <w:hyperlink r:id="rId74">
               <w:r>
                 <w:rPr>
                   <w:rStyle w:val="Hyperlink"/>
@@ -7691,7 +7820,7 @@
             <w:r>
               <w:t xml:space="preserve"> </w:t>
             </w:r>
-            <w:hyperlink r:id="rId76">
+            <w:hyperlink r:id="rId75">
               <w:r>
                 <w:rPr>
                   <w:rStyle w:val="Hyperlink"/>
@@ -7781,9 +7910,9 @@
         </w:pict>
       </w:r>
     </w:p>
+    <w:bookmarkEnd w:id="76"/>
     <w:bookmarkEnd w:id="77"/>
-    <w:bookmarkEnd w:id="78"/>
-    <w:bookmarkStart w:id="110" w:name="where-to-get-help"/>
+    <w:bookmarkStart w:id="109" w:name="where-to-get-help"/>
     <w:p>
       <w:pPr>
         <w:pStyle w:val="Heading1"/>
@@ -7810,7 +7939,7 @@
         <w:t xml:space="preserve">Please use these.</w:t>
       </w:r>
     </w:p>
-    <w:bookmarkStart w:id="83" w:name="course-help"/>
+    <w:bookmarkStart w:id="82" w:name="course-help"/>
     <w:p>
       <w:pPr>
         <w:pStyle w:val="Heading2"/>
@@ -7906,18 +8035,7 @@
               <w:jc w:val="left"/>
             </w:pPr>
             <w:r>
-              <w:t xml:space="preserve">The CS50 Duck (</w:t>
-            </w:r>
-            <w:hyperlink r:id="rId22">
-              <w:r>
-                <w:rPr>
-                  <w:rStyle w:val="Hyperlink"/>
-                </w:rPr>
-                <w:t xml:space="preserve">cs50.ai</w:t>
-              </w:r>
-            </w:hyperlink>
-            <w:r>
-              <w:t xml:space="preserve">), or ask in Slack</w:t>
+              <w:t xml:space="preserve">The CS50 Duck in cs50.dev, or ask in Slack</w:t>
             </w:r>
           </w:p>
         </w:tc>
@@ -7942,7 +8060,7 @@
               <w:pStyle w:val="Compact"/>
               <w:jc w:val="left"/>
             </w:pPr>
-            <w:hyperlink r:id="rId79">
+            <w:hyperlink r:id="rId78">
               <w:r>
                 <w:rPr>
                   <w:rStyle w:val="Hyperlink"/>
@@ -7959,7 +8077,7 @@
             <w:r>
               <w:t xml:space="preserve"> </w:t>
             </w:r>
-            <w:hyperlink r:id="rId80">
+            <w:hyperlink r:id="rId79">
               <w:r>
                 <w:rPr>
                   <w:rStyle w:val="Hyperlink"/>
@@ -7990,7 +8108,7 @@
               <w:pStyle w:val="Compact"/>
               <w:jc w:val="left"/>
             </w:pPr>
-            <w:hyperlink r:id="rId81">
+            <w:hyperlink r:id="rId80">
               <w:r>
                 <w:rPr>
                   <w:rStyle w:val="Hyperlink"/>
@@ -8007,7 +8125,7 @@
             <w:r>
               <w:t xml:space="preserve"> </w:t>
             </w:r>
-            <w:hyperlink r:id="rId82">
+            <w:hyperlink r:id="rId81">
               <w:r>
                 <w:rPr>
                   <w:rStyle w:val="Hyperlink"/>
@@ -8019,8 +8137,8 @@
         </w:tc>
       </w:tr>
     </w:tbl>
-    <w:bookmarkEnd w:id="83"/>
-    <w:bookmarkStart w:id="92" w:name="tech-help"/>
+    <w:bookmarkEnd w:id="82"/>
+    <w:bookmarkStart w:id="91" w:name="tech-help"/>
     <w:p>
       <w:pPr>
         <w:pStyle w:val="Heading2"/>
@@ -8089,7 +8207,7 @@
               <w:pStyle w:val="Compact"/>
               <w:jc w:val="left"/>
             </w:pPr>
-            <w:hyperlink r:id="rId84">
+            <w:hyperlink r:id="rId83">
               <w:r>
                 <w:rPr>
                   <w:rStyle w:val="Hyperlink"/>
@@ -8106,7 +8224,7 @@
             <w:r>
               <w:t xml:space="preserve"> </w:t>
             </w:r>
-            <w:hyperlink r:id="rId85">
+            <w:hyperlink r:id="rId84">
               <w:r>
                 <w:rPr>
                   <w:rStyle w:val="Hyperlink"/>
@@ -8183,7 +8301,7 @@
             <w:r>
               <w:t xml:space="preserve"> </w:t>
             </w:r>
-            <w:hyperlink r:id="rId86">
+            <w:hyperlink r:id="rId85">
               <w:r>
                 <w:rPr>
                   <w:rStyle w:val="Hyperlink"/>
@@ -8214,7 +8332,7 @@
               <w:pStyle w:val="Compact"/>
               <w:jc w:val="left"/>
             </w:pPr>
-            <w:hyperlink r:id="rId87">
+            <w:hyperlink r:id="rId86">
               <w:r>
                 <w:rPr>
                   <w:rStyle w:val="Hyperlink"/>
@@ -8248,7 +8366,7 @@
               <w:pStyle w:val="Compact"/>
               <w:jc w:val="left"/>
             </w:pPr>
-            <w:hyperlink r:id="rId88">
+            <w:hyperlink r:id="rId87">
               <w:r>
                 <w:rPr>
                   <w:rStyle w:val="Hyperlink"/>
@@ -8279,7 +8397,7 @@
               <w:pStyle w:val="Compact"/>
               <w:jc w:val="left"/>
             </w:pPr>
-            <w:hyperlink r:id="rId89">
+            <w:hyperlink r:id="rId88">
               <w:r>
                 <w:rPr>
                   <w:rStyle w:val="Hyperlink"/>
@@ -8296,7 +8414,7 @@
             <w:r>
               <w:t xml:space="preserve"> </w:t>
             </w:r>
-            <w:hyperlink r:id="rId90">
+            <w:hyperlink r:id="rId89">
               <w:r>
                 <w:rPr>
                   <w:rStyle w:val="Hyperlink"/>
@@ -8313,7 +8431,7 @@
             <w:r>
               <w:t xml:space="preserve"> </w:t>
             </w:r>
-            <w:hyperlink r:id="rId91">
+            <w:hyperlink r:id="rId90">
               <w:r>
                 <w:rPr>
                   <w:rStyle w:val="Hyperlink"/>
@@ -8325,8 +8443,8 @@
         </w:tc>
       </w:tr>
     </w:tbl>
-    <w:bookmarkEnd w:id="92"/>
-    <w:bookmarkStart w:id="109" w:name="life-help"/>
+    <w:bookmarkEnd w:id="91"/>
+    <w:bookmarkStart w:id="108" w:name="life-help"/>
     <w:p>
       <w:pPr>
         <w:pStyle w:val="Heading2"/>
@@ -8395,7 +8513,7 @@
               <w:pStyle w:val="Compact"/>
               <w:jc w:val="left"/>
             </w:pPr>
-            <w:hyperlink r:id="rId93">
+            <w:hyperlink r:id="rId92">
               <w:r>
                 <w:rPr>
                   <w:rStyle w:val="Hyperlink"/>
@@ -8412,7 +8530,7 @@
             <w:r>
               <w:t xml:space="preserve"> </w:t>
             </w:r>
-            <w:hyperlink r:id="rId94">
+            <w:hyperlink r:id="rId93">
               <w:r>
                 <w:rPr>
                   <w:rStyle w:val="Hyperlink"/>
@@ -8429,7 +8547,7 @@
             <w:r>
               <w:t xml:space="preserve"> </w:t>
             </w:r>
-            <w:hyperlink r:id="rId95">
+            <w:hyperlink r:id="rId94">
               <w:r>
                 <w:rPr>
                   <w:rStyle w:val="Hyperlink"/>
@@ -8460,7 +8578,7 @@
               <w:pStyle w:val="Compact"/>
               <w:jc w:val="left"/>
             </w:pPr>
-            <w:hyperlink r:id="rId96">
+            <w:hyperlink r:id="rId95">
               <w:r>
                 <w:rPr>
                   <w:rStyle w:val="Hyperlink"/>
@@ -8474,7 +8592,7 @@
             <w:r>
               <w:t xml:space="preserve">— monthly food boxes; contact Cath Busha, Dean of Student Engagement (</w:t>
             </w:r>
-            <w:hyperlink r:id="rId97">
+            <w:hyperlink r:id="rId96">
               <w:r>
                 <w:rPr>
                   <w:rStyle w:val="Hyperlink"/>
@@ -8508,7 +8626,7 @@
               <w:pStyle w:val="Compact"/>
               <w:jc w:val="left"/>
             </w:pPr>
-            <w:hyperlink r:id="rId70">
+            <w:hyperlink r:id="rId69">
               <w:r>
                 <w:rPr>
                   <w:rStyle w:val="Hyperlink"/>
@@ -8539,7 +8657,7 @@
               <w:pStyle w:val="Compact"/>
               <w:jc w:val="left"/>
             </w:pPr>
-            <w:hyperlink r:id="rId98">
+            <w:hyperlink r:id="rId97">
               <w:r>
                 <w:rPr>
                   <w:rStyle w:val="Hyperlink"/>
@@ -8576,7 +8694,7 @@
               <w:pStyle w:val="Compact"/>
               <w:jc w:val="left"/>
             </w:pPr>
-            <w:hyperlink r:id="rId99">
+            <w:hyperlink r:id="rId98">
               <w:r>
                 <w:rPr>
                   <w:rStyle w:val="Hyperlink"/>
@@ -8593,7 +8711,7 @@
             <w:r>
               <w:t xml:space="preserve"> </w:t>
             </w:r>
-            <w:hyperlink r:id="rId100">
+            <w:hyperlink r:id="rId99">
               <w:r>
                 <w:rPr>
                   <w:rStyle w:val="Hyperlink"/>
@@ -8624,7 +8742,7 @@
               <w:pStyle w:val="Compact"/>
               <w:jc w:val="left"/>
             </w:pPr>
-            <w:hyperlink r:id="rId101">
+            <w:hyperlink r:id="rId100">
               <w:r>
                 <w:rPr>
                   <w:rStyle w:val="Hyperlink"/>
@@ -8641,7 +8759,7 @@
             <w:r>
               <w:t xml:space="preserve"> </w:t>
             </w:r>
-            <w:hyperlink r:id="rId102">
+            <w:hyperlink r:id="rId101">
               <w:r>
                 <w:rPr>
                   <w:rStyle w:val="Hyperlink"/>
@@ -8672,7 +8790,7 @@
               <w:pStyle w:val="Compact"/>
               <w:jc w:val="left"/>
             </w:pPr>
-            <w:hyperlink r:id="rId103">
+            <w:hyperlink r:id="rId102">
               <w:r>
                 <w:rPr>
                   <w:rStyle w:val="Hyperlink"/>
@@ -8709,7 +8827,7 @@
               <w:pStyle w:val="Compact"/>
               <w:jc w:val="left"/>
             </w:pPr>
-            <w:hyperlink r:id="rId104">
+            <w:hyperlink r:id="rId103">
               <w:r>
                 <w:rPr>
                   <w:rStyle w:val="Hyperlink"/>
@@ -8726,7 +8844,7 @@
             <w:r>
               <w:t xml:space="preserve"> </w:t>
             </w:r>
-            <w:hyperlink r:id="rId105">
+            <w:hyperlink r:id="rId104">
               <w:r>
                 <w:rPr>
                   <w:rStyle w:val="Hyperlink"/>
@@ -8772,7 +8890,7 @@
       <w:r>
         <w:t xml:space="preserve"> </w:t>
       </w:r>
-      <w:hyperlink r:id="rId106">
+      <w:hyperlink r:id="rId105">
         <w:r>
           <w:rPr>
             <w:rStyle w:val="Hyperlink"/>
@@ -8786,7 +8904,7 @@
       <w:r>
         <w:t xml:space="preserve"> </w:t>
       </w:r>
-      <w:hyperlink r:id="rId107">
+      <w:hyperlink r:id="rId106">
         <w:r>
           <w:rPr>
             <w:rStyle w:val="Hyperlink"/>
@@ -8803,7 +8921,7 @@
       <w:r>
         <w:t xml:space="preserve"> </w:t>
       </w:r>
-      <w:hyperlink r:id="rId108">
+      <w:hyperlink r:id="rId107">
         <w:r>
           <w:rPr>
             <w:rStyle w:val="Hyperlink"/>
@@ -8822,46 +8940,46 @@
         </w:pict>
       </w:r>
     </w:p>
+    <w:bookmarkEnd w:id="108"/>
     <w:bookmarkEnd w:id="109"/>
+    <w:bookmarkStart w:id="110" w:name="one-last-thing"/>
+    <w:p>
+      <w:pPr>
+        <w:pStyle w:val="Heading1"/>
+      </w:pPr>
+      <w:r>
+        <w:t xml:space="preserve">One last thing</w:t>
+      </w:r>
+    </w:p>
+    <w:p>
+      <w:pPr>
+        <w:pStyle w:val="FirstParagraph"/>
+      </w:pPr>
+      <w:r>
+        <w:t xml:space="preserve">Programming is learned by doing it badly, repeatedly, until it clicks. Everyone’s code breaks. Everyone gets stuck. The students who do well in here aren’t the ones who never get stuck — they’re the ones who ask sooner.</w:t>
+      </w:r>
+    </w:p>
+    <w:p>
+      <w:pPr>
+        <w:pStyle w:val="BodyText"/>
+      </w:pPr>
+      <w:r>
+        <w:t xml:space="preserve">So ask. I’m on Slack, and I’m glad you’re here.</w:t>
+      </w:r>
+    </w:p>
+    <w:p>
+      <w:pPr>
+        <w:pStyle w:val="BodyText"/>
+      </w:pPr>
+      <w:r>
+        <w:rPr>
+          <w:bCs/>
+          <w:b/>
+        </w:rPr>
+        <w:t xml:space="preserve">— Bruce</w:t>
+      </w:r>
+    </w:p>
     <w:bookmarkEnd w:id="110"/>
-    <w:bookmarkStart w:id="111" w:name="one-last-thing"/>
-    <w:p>
-      <w:pPr>
-        <w:pStyle w:val="Heading1"/>
-      </w:pPr>
-      <w:r>
-        <w:t xml:space="preserve">One last thing</w:t>
-      </w:r>
-    </w:p>
-    <w:p>
-      <w:pPr>
-        <w:pStyle w:val="FirstParagraph"/>
-      </w:pPr>
-      <w:r>
-        <w:t xml:space="preserve">Programming is learned by doing it badly, repeatedly, until it clicks. Everyone’s code breaks. Everyone gets stuck. The students who do well in here aren’t the ones who never get stuck — they’re the ones who ask sooner.</w:t>
-      </w:r>
-    </w:p>
-    <w:p>
-      <w:pPr>
-        <w:pStyle w:val="BodyText"/>
-      </w:pPr>
-      <w:r>
-        <w:t xml:space="preserve">So ask. I’m on Slack, and I’m glad you’re here.</w:t>
-      </w:r>
-    </w:p>
-    <w:p>
-      <w:pPr>
-        <w:pStyle w:val="BodyText"/>
-      </w:pPr>
-      <w:r>
-        <w:rPr>
-          <w:bCs/>
-          <w:b/>
-        </w:rPr>
-        <w:t xml:space="preserve">— Bruce</w:t>
-      </w:r>
-    </w:p>
-    <w:bookmarkEnd w:id="111"/>
     <w:sectPr>
       <w:pgSz w:w="12240" w:h="15840"/>
       <w:pgMar w:top="1440" w:right="1440" w:bottom="1440" w:left="1440" w:header="720" w:footer="720" w:gutter="0"/>
@@ -9208,6 +9326,9 @@
     <w:abstractNumId w:val="991"/>
   </w:num>
   <w:num w:numId="1016">
+    <w:abstractNumId w:val="991"/>
+  </w:num>
+  <w:num w:numId="1017">
     <w:abstractNumId w:val="991"/>
   </w:num>
 </w:numbering>

</xml_diff>

<commit_message>
Expand the Regret Clause into a full section
The first version stated the rule but answered none of the questions a
worried student would actually have. It now covers: what happens to the
work (redo it honestly, graded normally, no late penalty), that nothing
goes to Student Conduct and no finding is recorded, exactly how to
disclose and how little detail is owed, when to use it, the December 4
cutoff, how the redo date is set and how long it typically is, what
happens if the redo date passes, and a two-column covers / does-not-cover
table. Closes with what the clause cannot do -- it does not give back the
practice skipped, and the proctored assessments are where that shows.

Rendered as an h3.mini heading so it reads as a real subsection.

37 build checks pass. Syllabus PDF grows 15 -> 16 pages.

Co-Authored-By: Claude Opus 5 <noreply@anthropic.com>
Claude-Session: https://claude.ai/code/session_018x18zWwXGxwsgkDproSP2N
</commit_message>
<xml_diff>
--- a/fall-2026/ctec121/CTEC_121_Syllabus_Fall_2026.docx
+++ b/fall-2026/ctec121/CTEC_121_Syllabus_Fall_2026.docx
@@ -5398,7 +5398,7 @@
       </w:r>
     </w:p>
     <w:bookmarkEnd w:id="46"/>
-    <w:bookmarkStart w:id="56" w:name="course-agreements"/>
+    <w:bookmarkStart w:id="57" w:name="course-agreements"/>
     <w:p>
       <w:pPr>
         <w:pStyle w:val="Heading1"/>
@@ -5747,7 +5747,7 @@
       </w:r>
     </w:p>
     <w:bookmarkEnd w:id="48"/>
-    <w:bookmarkStart w:id="50" w:name="academic-honesty"/>
+    <w:bookmarkStart w:id="51" w:name="academic-honesty"/>
     <w:p>
       <w:pPr>
         <w:pStyle w:val="Heading2"/>
@@ -6265,6 +6265,39 @@
         <w:t xml:space="preserve">consequences follow Clark’s academic dishonesty policy: no credit on the assessment, a failing course grade for serious or repeated violations, and possible referral to Student Conduct. You have the right to respond before any finding is made and to appeal through the division chair.</w:t>
       </w:r>
     </w:p>
+    <w:bookmarkStart w:id="50" w:name="the-regret-clause"/>
+    <w:p>
+      <w:pPr>
+        <w:pStyle w:val="Heading3"/>
+      </w:pPr>
+      <w:r>
+        <w:t xml:space="preserve">The Regret Clause</w:t>
+      </w:r>
+    </w:p>
+    <w:p>
+      <w:pPr>
+        <w:pStyle w:val="FirstParagraph"/>
+      </w:pPr>
+      <w:r>
+        <w:t xml:space="preserve">Most academic dishonesty I have seen came from a deadline, a bad week, and a blank editor lining up badly — not from someone setting out to cheat.</w:t>
+      </w:r>
+      <w:r>
+        <w:t xml:space="preserve"> </w:t>
+      </w:r>
+      <w:r>
+        <w:rPr>
+          <w:bCs/>
+          <w:b/>
+        </w:rPr>
+        <w:t xml:space="preserve">The Regret Clause exists so one of those moments doesn’t decide your quarter.</w:t>
+      </w:r>
+      <w:r>
+        <w:t xml:space="preserve"> </w:t>
+      </w:r>
+      <w:r>
+        <w:t xml:space="preserve">Tell me you crossed the line, and once per quarter it costs you nothing.</w:t>
+      </w:r>
+    </w:p>
     <w:p>
       <w:pPr>
         <w:pStyle w:val="BodyText"/>
@@ -6274,13 +6307,7 @@
           <w:bCs/>
           <w:b/>
         </w:rPr>
-        <w:t xml:space="preserve">The Regret Clause.</w:t>
-      </w:r>
-      <w:r>
-        <w:t xml:space="preserve"> </w:t>
-      </w:r>
-      <w:r>
-        <w:t xml:space="preserve">If you cross that line and tell me, it costs you nothing — once. Name the assignment, say what you did, and there is no penalty and no referral. We sort it out and move on.</w:t>
+        <w:t xml:space="preserve">How it works</w:t>
       </w:r>
     </w:p>
     <w:p>
@@ -6292,20 +6319,17 @@
         <w:pStyle w:val="Compact"/>
       </w:pPr>
       <w:r>
-        <w:t xml:space="preserve">It works</w:t>
-      </w:r>
-      <w:r>
-        <w:t xml:space="preserve"> </w:t>
-      </w:r>
-      <w:r>
-        <w:rPr>
-          <w:bCs/>
-          <w:b/>
-        </w:rPr>
-        <w:t xml:space="preserve">one time</w:t>
-      </w:r>
-      <w:r>
-        <w:t xml:space="preserve">, for the whole quarter.</w:t>
+        <w:rPr>
+          <w:bCs/>
+          <w:b/>
+        </w:rPr>
+        <w:t xml:space="preserve">You get one, for the whole quarter.</w:t>
+      </w:r>
+      <w:r>
+        <w:t xml:space="preserve"> </w:t>
+      </w:r>
+      <w:r>
+        <w:t xml:space="preserve">Not one per assignment. One.</w:t>
       </w:r>
     </w:p>
     <w:p>
@@ -6317,23 +6341,17 @@
         <w:pStyle w:val="Compact"/>
       </w:pPr>
       <w:r>
-        <w:t xml:space="preserve">Use it</w:t>
-      </w:r>
-      <w:r>
-        <w:t xml:space="preserve"> </w:t>
-      </w:r>
-      <w:r>
-        <w:rPr>
-          <w:bCs/>
-          <w:b/>
-        </w:rPr>
-        <w:t xml:space="preserve">before I have noticed, or after I have asked you about a piece of work.</w:t>
-      </w:r>
-      <w:r>
-        <w:t xml:space="preserve"> </w:t>
-      </w:r>
-      <w:r>
-        <w:t xml:space="preserve">Either way counts.</w:t>
+        <w:rPr>
+          <w:bCs/>
+          <w:b/>
+        </w:rPr>
+        <w:t xml:space="preserve">Come to me before I have noticed, or after I have asked you about a piece of work.</w:t>
+      </w:r>
+      <w:r>
+        <w:t xml:space="preserve"> </w:t>
+      </w:r>
+      <w:r>
+        <w:t xml:space="preserve">Both count. If I ask you to walk me through your code and you would rather tell me the truth than perform the walk-through, say so right there — that is the moment this was built for.</w:t>
       </w:r>
     </w:p>
     <w:p>
@@ -6345,23 +6363,35 @@
         <w:pStyle w:val="Compact"/>
       </w:pPr>
       <w:r>
-        <w:t xml:space="preserve">It covers</w:t>
-      </w:r>
-      <w:r>
-        <w:t xml:space="preserve"> </w:t>
-      </w:r>
-      <w:r>
-        <w:rPr>
-          <w:bCs/>
-          <w:b/>
-        </w:rPr>
-        <w:t xml:space="preserve">academic honesty</w:t>
-      </w:r>
-      <w:r>
-        <w:t xml:space="preserve"> </w:t>
-      </w:r>
-      <w:r>
-        <w:t xml:space="preserve">— the AI rule, plagiarism, collaboration that went further than it should have.</w:t>
+        <w:rPr>
+          <w:bCs/>
+          <w:b/>
+        </w:rPr>
+        <w:t xml:space="preserve">You redo the work honestly, and I grade it normally.</w:t>
+      </w:r>
+      <w:r>
+        <w:t xml:space="preserve"> </w:t>
+      </w:r>
+      <w:r>
+        <w:t xml:space="preserve">No late penalty, no lowered ceiling, no note in the gradebook. That is what</w:t>
+      </w:r>
+      <w:r>
+        <w:t xml:space="preserve"> </w:t>
+      </w:r>
+      <w:r>
+        <w:t xml:space="preserve">“</w:t>
+      </w:r>
+      <w:r>
+        <w:t xml:space="preserve">no penalty</w:t>
+      </w:r>
+      <w:r>
+        <w:t xml:space="preserve">”</w:t>
+      </w:r>
+      <w:r>
+        <w:t xml:space="preserve"> </w:t>
+      </w:r>
+      <w:r>
+        <w:t xml:space="preserve">means here: your grade is whatever the honest work earns.</w:t>
       </w:r>
     </w:p>
     <w:p>
@@ -6373,7 +6403,54 @@
         <w:pStyle w:val="Compact"/>
       </w:pPr>
       <w:r>
-        <w:t xml:space="preserve">To use it, message me on Slack or email me with the assignment name and what happened.</w:t>
+        <w:rPr>
+          <w:bCs/>
+          <w:b/>
+        </w:rPr>
+        <w:t xml:space="preserve">Nothing goes to Student Conduct</w:t>
+      </w:r>
+      <w:r>
+        <w:t xml:space="preserve">, and no finding is recorded against you. I keep a private note that you have used it, because there is only one.</w:t>
+      </w:r>
+    </w:p>
+    <w:p>
+      <w:pPr>
+        <w:numPr>
+          <w:ilvl w:val="0"/>
+          <w:numId w:val="1013"/>
+        </w:numPr>
+        <w:pStyle w:val="Compact"/>
+      </w:pPr>
+      <w:r>
+        <w:rPr>
+          <w:bCs/>
+          <w:b/>
+        </w:rPr>
+        <w:t xml:space="preserve">Tell me in writing</w:t>
+      </w:r>
+      <w:r>
+        <w:t xml:space="preserve"> </w:t>
+      </w:r>
+      <w:r>
+        <w:t xml:space="preserve">— Slack or email — with the assignment name, what you did, and what you will do instead. Three sentences is plenty.</w:t>
+      </w:r>
+      <w:r>
+        <w:t xml:space="preserve"> </w:t>
+      </w:r>
+      <w:r>
+        <w:t xml:space="preserve">“</w:t>
+      </w:r>
+      <w:r>
+        <w:t xml:space="preserve">I used an AI to write the loops in Problem Set 3 and I will rewrite them myself</w:t>
+      </w:r>
+      <w:r>
+        <w:t xml:space="preserve">”</w:t>
+      </w:r>
+      <w:r>
+        <w:t xml:space="preserve"> </w:t>
+      </w:r>
+      <w:r>
+        <w:t xml:space="preserve">is a complete disclosure. You do not owe me an explanation of your life.</w:t>
       </w:r>
     </w:p>
     <w:p>
@@ -6381,35 +6458,11 @@
         <w:pStyle w:val="FirstParagraph"/>
       </w:pPr>
       <w:r>
-        <w:t xml:space="preserve">People make bad calls at 2 AM in a week that got away from them. That should not decide your quarter, and I would far rather hear it from you than find it myself. There is only one, so use it when it counts.</w:t>
-      </w:r>
-    </w:p>
-    <w:p>
-      <w:pPr>
-        <w:pStyle w:val="BodyText"/>
-      </w:pPr>
-      <w:r>
-        <w:rPr>
-          <w:bCs/>
-          <w:b/>
-        </w:rPr>
-        <w:t xml:space="preserve">When in doubt, ask me first — in writing, so we both have the answer.</w:t>
-      </w:r>
-      <w:r>
-        <w:t xml:space="preserve"> </w:t>
-      </w:r>
-      <w:r>
-        <w:t xml:space="preserve">Asking in good faith never counts against you.</w:t>
-      </w:r>
-    </w:p>
-    <w:bookmarkEnd w:id="50"/>
-    <w:bookmarkStart w:id="51" w:name="classroom-norms"/>
-    <w:p>
-      <w:pPr>
-        <w:pStyle w:val="Heading2"/>
-      </w:pPr>
-      <w:r>
-        <w:t xml:space="preserve">Classroom norms</w:t>
+        <w:rPr>
+          <w:bCs/>
+          <w:b/>
+        </w:rPr>
+        <w:t xml:space="preserve">When to use it, and when the redo is due</w:t>
       </w:r>
     </w:p>
     <w:p>
@@ -6421,7 +6474,17 @@
         <w:pStyle w:val="Compact"/>
       </w:pPr>
       <w:r>
-        <w:t xml:space="preserve">Complete each week’s module — readings, assignments, and discussions — by the due date.</w:t>
+        <w:rPr>
+          <w:bCs/>
+          <w:b/>
+        </w:rPr>
+        <w:t xml:space="preserve">Use it as soon as you realize.</w:t>
+      </w:r>
+      <w:r>
+        <w:t xml:space="preserve"> </w:t>
+      </w:r>
+      <w:r>
+        <w:t xml:space="preserve">Waiting doesn’t improve anything, and a disclosure that arrives after I have already started a conversation with your division chair is too late to be this.</w:t>
       </w:r>
     </w:p>
     <w:p>
@@ -6433,7 +6496,17 @@
         <w:pStyle w:val="Compact"/>
       </w:pPr>
       <w:r>
-        <w:t xml:space="preserve">Take part in class discussions and exercises, and bring your own experiences into them.</w:t>
+        <w:rPr>
+          <w:bCs/>
+          <w:b/>
+        </w:rPr>
+        <w:t xml:space="preserve">The last day to use it is Friday, December 4</w:t>
+      </w:r>
+      <w:r>
+        <w:t xml:space="preserve"> </w:t>
+      </w:r>
+      <w:r>
+        <w:t xml:space="preserve">— the final day of the quarter. After that, grades are being finalized and there is no room left to redo anything.</w:t>
       </w:r>
     </w:p>
     <w:p>
@@ -6445,7 +6518,33 @@
         <w:pStyle w:val="Compact"/>
       </w:pPr>
       <w:r>
-        <w:t xml:space="preserve">Be a courteous member of the room and don’t get in the way of anyone else’s learning.</w:t>
+        <w:rPr>
+          <w:bCs/>
+          <w:b/>
+        </w:rPr>
+        <w:t xml:space="preserve">We set the redo date together, in writing, the same day you tell me.</w:t>
+      </w:r>
+      <w:r>
+        <w:t xml:space="preserve"> </w:t>
+      </w:r>
+      <w:r>
+        <w:t xml:space="preserve">Expect</w:t>
+      </w:r>
+      <w:r>
+        <w:t xml:space="preserve"> </w:t>
+      </w:r>
+      <w:r>
+        <w:rPr>
+          <w:bCs/>
+          <w:b/>
+        </w:rPr>
+        <w:t xml:space="preserve">about a week</w:t>
+      </w:r>
+      <w:r>
+        <w:t xml:space="preserve"> </w:t>
+      </w:r>
+      <w:r>
+        <w:t xml:space="preserve">for a lab or a problem set. Later in the quarter it will be shorter — a disclosure about Module 8 or the final project may get only a few days, because the work still has to be graded before the quarter closes.</w:t>
       </w:r>
     </w:p>
     <w:p>
@@ -6457,23 +6556,273 @@
         <w:pStyle w:val="Compact"/>
       </w:pPr>
       <w:r>
-        <w:t xml:space="preserve">Academic and intellectual honesty are expected at all times.</w:t>
+        <w:rPr>
+          <w:bCs/>
+          <w:b/>
+        </w:rPr>
+        <w:t xml:space="preserve">If the redo date passes and nothing arrives,</w:t>
+      </w:r>
+      <w:r>
+        <w:t xml:space="preserve"> </w:t>
+      </w:r>
+      <w:r>
+        <w:t xml:space="preserve">the clause has been used and the original consequences apply. Tell me if you need the date moved; that conversation is always available.</w:t>
+      </w:r>
+    </w:p>
+    <w:tbl>
+      <w:tblPr>
+        <w:tblStyle w:val="Table"/>
+        <w:tblW w:type="pct" w:w="5000"/>
+        <w:tblLook w:firstRow="1" w:lastRow="0" w:firstColumn="0" w:lastColumn="0" w:noHBand="0" w:noVBand="0" w:val="0020"/>
+        <w:jc w:val="start"/>
+      </w:tblPr>
+      <w:tblGrid>
+        <w:gridCol w:w="3960"/>
+        <w:gridCol w:w="3960"/>
+      </w:tblGrid>
+      <w:tr>
+        <w:trPr>
+          <w:tblHeader w:val="true"/>
+        </w:trPr>
+        <w:tc>
+          <w:tcPr/>
+          <w:p>
+            <w:pPr>
+              <w:pStyle w:val="Compact"/>
+              <w:jc w:val="left"/>
+            </w:pPr>
+            <w:r>
+              <w:t xml:space="preserve">The clause covers</w:t>
+            </w:r>
+          </w:p>
+        </w:tc>
+        <w:tc>
+          <w:tcPr/>
+          <w:p>
+            <w:pPr>
+              <w:pStyle w:val="Compact"/>
+              <w:jc w:val="left"/>
+            </w:pPr>
+            <w:r>
+              <w:t xml:space="preserve">The clause does not cover</w:t>
+            </w:r>
+          </w:p>
+        </w:tc>
+      </w:tr>
+      <w:tr>
+        <w:tc>
+          <w:tcPr/>
+          <w:p>
+            <w:pPr>
+              <w:pStyle w:val="Compact"/>
+              <w:jc w:val="left"/>
+            </w:pPr>
+            <w:r>
+              <w:t xml:space="preserve">Take-home work — labs, problem sets, collaborative assignments, the final project</w:t>
+            </w:r>
+          </w:p>
+        </w:tc>
+        <w:tc>
+          <w:tcPr/>
+          <w:p>
+            <w:pPr>
+              <w:pStyle w:val="Compact"/>
+              <w:jc w:val="left"/>
+            </w:pPr>
+            <w:r>
+              <w:t xml:space="preserve">The quizzes, the midterm, and the final exam. Those are proctored and closed-book, and go through the normal process</w:t>
+            </w:r>
+          </w:p>
+        </w:tc>
+      </w:tr>
+      <w:tr>
+        <w:tc>
+          <w:tcPr/>
+          <w:p>
+            <w:pPr>
+              <w:pStyle w:val="Compact"/>
+              <w:jc w:val="left"/>
+            </w:pPr>
+            <w:r>
+              <w:t xml:space="preserve">An AI writing, completing, or suggesting code you submitted</w:t>
+            </w:r>
+          </w:p>
+        </w:tc>
+        <w:tc>
+          <w:tcPr/>
+          <w:p>
+            <w:pPr>
+              <w:pStyle w:val="Compact"/>
+              <w:jc w:val="left"/>
+            </w:pPr>
+            <w:r>
+              <w:t xml:space="preserve">A second violation. There is one clause; after it, the consequences above apply</w:t>
+            </w:r>
+          </w:p>
+        </w:tc>
+      </w:tr>
+      <w:tr>
+        <w:tc>
+          <w:tcPr/>
+          <w:p>
+            <w:pPr>
+              <w:pStyle w:val="Compact"/>
+              <w:jc w:val="left"/>
+            </w:pPr>
+            <w:r>
+              <w:t xml:space="preserve">Work you copied from a classmate, from the web, or from a previous quarter</w:t>
+            </w:r>
+          </w:p>
+        </w:tc>
+        <w:tc>
+          <w:tcPr/>
+          <w:p>
+            <w:pPr>
+              <w:pStyle w:val="Compact"/>
+              <w:jc w:val="left"/>
+            </w:pPr>
+            <w:r>
+              <w:t xml:space="preserve">Using an account that isn’t yours, altering scores, or exploiting a grading flaw</w:t>
+            </w:r>
+          </w:p>
+        </w:tc>
+      </w:tr>
+      <w:tr>
+        <w:tc>
+          <w:tcPr/>
+          <w:p>
+            <w:pPr>
+              <w:pStyle w:val="Compact"/>
+              <w:jc w:val="left"/>
+            </w:pPr>
+            <w:r>
+              <w:t xml:space="preserve">Collaboration that went further than an individual assignment allowed</w:t>
+            </w:r>
+          </w:p>
+        </w:tc>
+        <w:tc>
+          <w:tcPr/>
+          <w:p>
+            <w:pPr>
+              <w:pStyle w:val="Compact"/>
+              <w:jc w:val="left"/>
+            </w:pPr>
+            <w:r>
+              <w:t xml:space="preserve">Someone else’s violation. It is yours to use, not to lend</w:t>
+            </w:r>
+          </w:p>
+        </w:tc>
+      </w:tr>
+    </w:tbl>
+    <w:p>
+      <w:pPr>
+        <w:pStyle w:val="BodyText"/>
+      </w:pPr>
+      <w:r>
+        <w:rPr>
+          <w:bCs/>
+          <w:b/>
+        </w:rPr>
+        <w:t xml:space="preserve">What it can’t do.</w:t>
+      </w:r>
+      <w:r>
+        <w:t xml:space="preserve"> </w:t>
+      </w:r>
+      <w:r>
+        <w:t xml:space="preserve">It can’t give you back the practice you skipped. The quizzes, the midterm and the final exam are on paper with nothing to lean on, and your project presentation is a conversation about code you are expected to know. Work that isn’t yours doesn’t fail you in Week 4 — it fails you in Week 11, quietly, when the material isn’t there. So use the clause, then use the reset: come to student hours, ask on Slack, work the problem with the Duck until you can explain it out loud. That part is what actually saves the quarter.</w:t>
+      </w:r>
+    </w:p>
+    <w:p>
+      <w:pPr>
+        <w:pStyle w:val="BodyText"/>
+      </w:pPr>
+      <w:r>
+        <w:rPr>
+          <w:bCs/>
+          <w:b/>
+        </w:rPr>
+        <w:t xml:space="preserve">When in doubt, ask me first — in writing, so we both have the answer.</w:t>
+      </w:r>
+      <w:r>
+        <w:t xml:space="preserve"> </w:t>
+      </w:r>
+      <w:r>
+        <w:t xml:space="preserve">Asking in good faith never counts against you.</w:t>
+      </w:r>
+    </w:p>
+    <w:bookmarkEnd w:id="50"/>
+    <w:bookmarkEnd w:id="51"/>
+    <w:bookmarkStart w:id="52" w:name="classroom-norms"/>
+    <w:p>
+      <w:pPr>
+        <w:pStyle w:val="Heading2"/>
+      </w:pPr>
+      <w:r>
+        <w:t xml:space="preserve">Classroom norms</w:t>
       </w:r>
     </w:p>
     <w:p>
       <w:pPr>
         <w:numPr>
           <w:ilvl w:val="0"/>
-          <w:numId w:val="1014"/>
+          <w:numId w:val="1015"/>
         </w:numPr>
         <w:pStyle w:val="Compact"/>
       </w:pPr>
       <w:r>
+        <w:t xml:space="preserve">Complete each week’s module — readings, assignments, and discussions — by the due date.</w:t>
+      </w:r>
+    </w:p>
+    <w:p>
+      <w:pPr>
+        <w:numPr>
+          <w:ilvl w:val="0"/>
+          <w:numId w:val="1015"/>
+        </w:numPr>
+        <w:pStyle w:val="Compact"/>
+      </w:pPr>
+      <w:r>
+        <w:t xml:space="preserve">Take part in class discussions and exercises, and bring your own experiences into them.</w:t>
+      </w:r>
+    </w:p>
+    <w:p>
+      <w:pPr>
+        <w:numPr>
+          <w:ilvl w:val="0"/>
+          <w:numId w:val="1015"/>
+        </w:numPr>
+        <w:pStyle w:val="Compact"/>
+      </w:pPr>
+      <w:r>
+        <w:t xml:space="preserve">Be a courteous member of the room and don’t get in the way of anyone else’s learning.</w:t>
+      </w:r>
+    </w:p>
+    <w:p>
+      <w:pPr>
+        <w:numPr>
+          <w:ilvl w:val="0"/>
+          <w:numId w:val="1015"/>
+        </w:numPr>
+        <w:pStyle w:val="Compact"/>
+      </w:pPr>
+      <w:r>
+        <w:t xml:space="preserve">Academic and intellectual honesty are expected at all times.</w:t>
+      </w:r>
+    </w:p>
+    <w:p>
+      <w:pPr>
+        <w:numPr>
+          <w:ilvl w:val="0"/>
+          <w:numId w:val="1015"/>
+        </w:numPr>
+        <w:pStyle w:val="Compact"/>
+      </w:pPr>
+      <w:r>
         <w:t xml:space="preserve">Tell me as early as you can about anything that affects your ability to take part fully.</w:t>
       </w:r>
     </w:p>
-    <w:bookmarkEnd w:id="51"/>
-    <w:bookmarkStart w:id="52" w:name="recording-class-sessions"/>
+    <w:bookmarkEnd w:id="52"/>
+    <w:bookmarkStart w:id="53" w:name="recording-class-sessions"/>
     <w:p>
       <w:pPr>
         <w:pStyle w:val="Heading2"/>
@@ -6500,8 +6849,8 @@
         <w:t xml:space="preserve">— no permission needed. Please don’t post or share recordings, screenshots, or classmates’ work outside this class. People share half-finished code and honest confusion in a programming class, and that only works if the room feels safe. If DAC has approved recording as an accommodation, you never need to explain that to anyone. If I record a session, I’ll say so and post it in Canvas.</w:t>
       </w:r>
     </w:p>
-    <w:bookmarkEnd w:id="52"/>
-    <w:bookmarkStart w:id="53" w:name="changes-to-this-syllabus"/>
+    <w:bookmarkEnd w:id="53"/>
+    <w:bookmarkStart w:id="54" w:name="changes-to-this-syllabus"/>
     <w:p>
       <w:pPr>
         <w:pStyle w:val="Heading2"/>
@@ -6518,8 +6867,8 @@
         <w:t xml:space="preserve">This is a plan, not a contract, and I may adjust it during the quarter. Anything that affects your grade or deadlines is announced on Canvas and Slack, and I’ll post an updated syllabus.</w:t>
       </w:r>
     </w:p>
-    <w:bookmarkEnd w:id="53"/>
-    <w:bookmarkStart w:id="55" w:name="withdrawing-from-the-course"/>
+    <w:bookmarkEnd w:id="54"/>
+    <w:bookmarkStart w:id="56" w:name="withdrawing-from-the-course"/>
     <w:p>
       <w:pPr>
         <w:pStyle w:val="Heading2"/>
@@ -6569,7 +6918,7 @@
       <w:r>
         <w:t xml:space="preserve"> </w:t>
       </w:r>
-      <w:hyperlink r:id="rId54">
+      <w:hyperlink r:id="rId55">
         <w:r>
           <w:rPr>
             <w:rStyle w:val="Hyperlink"/>
@@ -6609,9 +6958,9 @@
         </w:pict>
       </w:r>
     </w:p>
-    <w:bookmarkEnd w:id="55"/>
     <w:bookmarkEnd w:id="56"/>
-    <w:bookmarkStart w:id="57" w:name="what-youll-be-able-to-do-by-the-end"/>
+    <w:bookmarkEnd w:id="57"/>
+    <w:bookmarkStart w:id="58" w:name="what-youll-be-able-to-do-by-the-end"/>
     <w:p>
       <w:pPr>
         <w:pStyle w:val="Heading1"/>
@@ -6632,7 +6981,7 @@
       <w:pPr>
         <w:numPr>
           <w:ilvl w:val="0"/>
-          <w:numId w:val="1015"/>
+          <w:numId w:val="1016"/>
         </w:numPr>
         <w:pStyle w:val="Compact"/>
       </w:pPr>
@@ -6654,7 +7003,7 @@
       <w:pPr>
         <w:numPr>
           <w:ilvl w:val="0"/>
-          <w:numId w:val="1015"/>
+          <w:numId w:val="1016"/>
         </w:numPr>
         <w:pStyle w:val="Compact"/>
       </w:pPr>
@@ -6676,7 +7025,7 @@
       <w:pPr>
         <w:numPr>
           <w:ilvl w:val="0"/>
-          <w:numId w:val="1015"/>
+          <w:numId w:val="1016"/>
         </w:numPr>
         <w:pStyle w:val="Compact"/>
       </w:pPr>
@@ -6698,7 +7047,7 @@
       <w:pPr>
         <w:numPr>
           <w:ilvl w:val="0"/>
-          <w:numId w:val="1015"/>
+          <w:numId w:val="1016"/>
         </w:numPr>
         <w:pStyle w:val="Compact"/>
       </w:pPr>
@@ -7140,8 +7489,8 @@
         </w:pict>
       </w:r>
     </w:p>
-    <w:bookmarkEnd w:id="57"/>
-    <w:bookmarkStart w:id="77" w:name="college-policies"/>
+    <w:bookmarkEnd w:id="58"/>
+    <w:bookmarkStart w:id="78" w:name="college-policies"/>
     <w:p>
       <w:pPr>
         <w:pStyle w:val="Heading1"/>
@@ -7150,7 +7499,7 @@
         <w:t xml:space="preserve">College policies</w:t>
       </w:r>
     </w:p>
-    <w:bookmarkStart w:id="62" w:name="ada-accommodations"/>
+    <w:bookmarkStart w:id="63" w:name="ada-accommodations"/>
     <w:p>
       <w:pPr>
         <w:pStyle w:val="Heading2"/>
@@ -7185,7 +7534,7 @@
       <w:r>
         <w:t xml:space="preserve"> </w:t>
       </w:r>
-      <w:hyperlink r:id="rId58">
+      <w:hyperlink r:id="rId59">
         <w:r>
           <w:rPr>
             <w:rStyle w:val="Hyperlink"/>
@@ -7262,7 +7611,7 @@
               <w:pStyle w:val="Compact"/>
               <w:jc w:val="left"/>
             </w:pPr>
-            <w:hyperlink r:id="rId59">
+            <w:hyperlink r:id="rId60">
               <w:r>
                 <w:rPr>
                   <w:rStyle w:val="Hyperlink"/>
@@ -7279,7 +7628,7 @@
             <w:r>
               <w:t xml:space="preserve"> </w:t>
             </w:r>
-            <w:hyperlink r:id="rId60">
+            <w:hyperlink r:id="rId61">
               <w:r>
                 <w:rPr>
                   <w:rStyle w:val="Hyperlink"/>
@@ -7347,7 +7696,7 @@
       <w:r>
         <w:t xml:space="preserve"> </w:t>
       </w:r>
-      <w:hyperlink r:id="rId61">
+      <w:hyperlink r:id="rId62">
         <w:r>
           <w:rPr>
             <w:rStyle w:val="Hyperlink"/>
@@ -7383,8 +7732,8 @@
         <w:t xml:space="preserve">Once your accommodations are set, contact me so we can talk about this course specifically. If you have any emergency medical information I should know about, tell me by the end of week one.</w:t>
       </w:r>
     </w:p>
-    <w:bookmarkEnd w:id="62"/>
-    <w:bookmarkStart w:id="64" w:name="non-discrimination"/>
+    <w:bookmarkEnd w:id="63"/>
+    <w:bookmarkStart w:id="65" w:name="non-discrimination"/>
     <w:p>
       <w:pPr>
         <w:pStyle w:val="Heading2"/>
@@ -7411,7 +7760,7 @@
       <w:r>
         <w:t xml:space="preserve"> </w:t>
       </w:r>
-      <w:hyperlink r:id="rId63">
+      <w:hyperlink r:id="rId64">
         <w:r>
           <w:rPr>
             <w:rStyle w:val="Hyperlink"/>
@@ -7423,8 +7772,8 @@
         <w:t xml:space="preserve">.</w:t>
       </w:r>
     </w:p>
-    <w:bookmarkEnd w:id="64"/>
-    <w:bookmarkStart w:id="70" w:name="title-ix-and-sexual-misconduct"/>
+    <w:bookmarkEnd w:id="65"/>
+    <w:bookmarkStart w:id="71" w:name="title-ix-and-sexual-misconduct"/>
     <w:p>
       <w:pPr>
         <w:pStyle w:val="Heading2"/>
@@ -7463,11 +7812,11 @@
       <w:pPr>
         <w:numPr>
           <w:ilvl w:val="0"/>
-          <w:numId w:val="1016"/>
+          <w:numId w:val="1017"/>
         </w:numPr>
         <w:pStyle w:val="Compact"/>
       </w:pPr>
-      <w:hyperlink r:id="rId65">
+      <w:hyperlink r:id="rId66">
         <w:r>
           <w:rPr>
             <w:rStyle w:val="Hyperlink"/>
@@ -7480,11 +7829,11 @@
       <w:pPr>
         <w:numPr>
           <w:ilvl w:val="0"/>
-          <w:numId w:val="1016"/>
+          <w:numId w:val="1017"/>
         </w:numPr>
         <w:pStyle w:val="Compact"/>
       </w:pPr>
-      <w:hyperlink r:id="rId66">
+      <w:hyperlink r:id="rId67">
         <w:r>
           <w:rPr>
             <w:rStyle w:val="Hyperlink"/>
@@ -7497,11 +7846,11 @@
       <w:pPr>
         <w:numPr>
           <w:ilvl w:val="0"/>
-          <w:numId w:val="1016"/>
+          <w:numId w:val="1017"/>
         </w:numPr>
         <w:pStyle w:val="Compact"/>
       </w:pPr>
-      <w:hyperlink r:id="rId67">
+      <w:hyperlink r:id="rId68">
         <w:r>
           <w:rPr>
             <w:rStyle w:val="Hyperlink"/>
@@ -7514,11 +7863,11 @@
       <w:pPr>
         <w:numPr>
           <w:ilvl w:val="0"/>
-          <w:numId w:val="1016"/>
+          <w:numId w:val="1017"/>
         </w:numPr>
         <w:pStyle w:val="Compact"/>
       </w:pPr>
-      <w:hyperlink r:id="rId68">
+      <w:hyperlink r:id="rId69">
         <w:r>
           <w:rPr>
             <w:rStyle w:val="Hyperlink"/>
@@ -7531,11 +7880,11 @@
       <w:pPr>
         <w:numPr>
           <w:ilvl w:val="0"/>
-          <w:numId w:val="1016"/>
+          <w:numId w:val="1017"/>
         </w:numPr>
         <w:pStyle w:val="Compact"/>
       </w:pPr>
-      <w:hyperlink r:id="rId69">
+      <w:hyperlink r:id="rId70">
         <w:r>
           <w:rPr>
             <w:rStyle w:val="Hyperlink"/>
@@ -7544,8 +7893,8 @@
         </w:r>
       </w:hyperlink>
     </w:p>
-    <w:bookmarkEnd w:id="70"/>
-    <w:bookmarkStart w:id="72" w:name="student-rights-and-responsibilities"/>
+    <w:bookmarkEnd w:id="71"/>
+    <w:bookmarkStart w:id="73" w:name="student-rights-and-responsibilities"/>
     <w:p>
       <w:pPr>
         <w:pStyle w:val="Heading2"/>
@@ -7564,7 +7913,7 @@
       <w:r>
         <w:t xml:space="preserve"> </w:t>
       </w:r>
-      <w:hyperlink r:id="rId71">
+      <w:hyperlink r:id="rId72">
         <w:r>
           <w:rPr>
             <w:rStyle w:val="Hyperlink"/>
@@ -7595,8 +7944,8 @@
         <w:t xml:space="preserve">— no explanation needed beyond that.</w:t>
       </w:r>
     </w:p>
-    <w:bookmarkEnd w:id="72"/>
-    <w:bookmarkStart w:id="73" w:name="academic-dishonesty"/>
+    <w:bookmarkEnd w:id="73"/>
+    <w:bookmarkStart w:id="74" w:name="academic-dishonesty"/>
     <w:p>
       <w:pPr>
         <w:pStyle w:val="Heading2"/>
@@ -7617,7 +7966,7 @@
       <w:pPr>
         <w:numPr>
           <w:ilvl w:val="0"/>
-          <w:numId w:val="1017"/>
+          <w:numId w:val="1018"/>
         </w:numPr>
         <w:pStyle w:val="Compact"/>
       </w:pPr>
@@ -7639,7 +7988,7 @@
       <w:pPr>
         <w:numPr>
           <w:ilvl w:val="0"/>
-          <w:numId w:val="1017"/>
+          <w:numId w:val="1018"/>
         </w:numPr>
         <w:pStyle w:val="Compact"/>
       </w:pPr>
@@ -7693,8 +8042,8 @@
         <w:t xml:space="preserve">a failing grade on the assignment or, in extreme cases, the course. Students may also be referred to the Student Conduct Office, which can require learning activities or, in extreme or repeated cases, dismissal from a program. To challenge a finding, you can file a grade appeal starting with the division chair.</w:t>
       </w:r>
     </w:p>
-    <w:bookmarkEnd w:id="73"/>
-    <w:bookmarkStart w:id="76" w:name="emergencies"/>
+    <w:bookmarkEnd w:id="74"/>
+    <w:bookmarkStart w:id="77" w:name="emergencies"/>
     <w:p>
       <w:pPr>
         <w:pStyle w:val="Heading2"/>
@@ -7773,7 +8122,7 @@
             <w:r>
               <w:t xml:space="preserve"> </w:t>
             </w:r>
-            <w:hyperlink r:id="rId74">
+            <w:hyperlink r:id="rId75">
               <w:r>
                 <w:rPr>
                   <w:rStyle w:val="Hyperlink"/>
@@ -7820,7 +8169,7 @@
             <w:r>
               <w:t xml:space="preserve"> </w:t>
             </w:r>
-            <w:hyperlink r:id="rId75">
+            <w:hyperlink r:id="rId76">
               <w:r>
                 <w:rPr>
                   <w:rStyle w:val="Hyperlink"/>
@@ -7910,9 +8259,9 @@
         </w:pict>
       </w:r>
     </w:p>
-    <w:bookmarkEnd w:id="76"/>
     <w:bookmarkEnd w:id="77"/>
-    <w:bookmarkStart w:id="109" w:name="where-to-get-help"/>
+    <w:bookmarkEnd w:id="78"/>
+    <w:bookmarkStart w:id="110" w:name="where-to-get-help"/>
     <w:p>
       <w:pPr>
         <w:pStyle w:val="Heading1"/>
@@ -7939,7 +8288,7 @@
         <w:t xml:space="preserve">Please use these.</w:t>
       </w:r>
     </w:p>
-    <w:bookmarkStart w:id="82" w:name="course-help"/>
+    <w:bookmarkStart w:id="83" w:name="course-help"/>
     <w:p>
       <w:pPr>
         <w:pStyle w:val="Heading2"/>
@@ -8060,7 +8409,7 @@
               <w:pStyle w:val="Compact"/>
               <w:jc w:val="left"/>
             </w:pPr>
-            <w:hyperlink r:id="rId78">
+            <w:hyperlink r:id="rId79">
               <w:r>
                 <w:rPr>
                   <w:rStyle w:val="Hyperlink"/>
@@ -8077,7 +8426,7 @@
             <w:r>
               <w:t xml:space="preserve"> </w:t>
             </w:r>
-            <w:hyperlink r:id="rId79">
+            <w:hyperlink r:id="rId80">
               <w:r>
                 <w:rPr>
                   <w:rStyle w:val="Hyperlink"/>
@@ -8108,7 +8457,7 @@
               <w:pStyle w:val="Compact"/>
               <w:jc w:val="left"/>
             </w:pPr>
-            <w:hyperlink r:id="rId80">
+            <w:hyperlink r:id="rId81">
               <w:r>
                 <w:rPr>
                   <w:rStyle w:val="Hyperlink"/>
@@ -8125,7 +8474,7 @@
             <w:r>
               <w:t xml:space="preserve"> </w:t>
             </w:r>
-            <w:hyperlink r:id="rId81">
+            <w:hyperlink r:id="rId82">
               <w:r>
                 <w:rPr>
                   <w:rStyle w:val="Hyperlink"/>
@@ -8137,8 +8486,8 @@
         </w:tc>
       </w:tr>
     </w:tbl>
-    <w:bookmarkEnd w:id="82"/>
-    <w:bookmarkStart w:id="91" w:name="tech-help"/>
+    <w:bookmarkEnd w:id="83"/>
+    <w:bookmarkStart w:id="92" w:name="tech-help"/>
     <w:p>
       <w:pPr>
         <w:pStyle w:val="Heading2"/>
@@ -8207,7 +8556,7 @@
               <w:pStyle w:val="Compact"/>
               <w:jc w:val="left"/>
             </w:pPr>
-            <w:hyperlink r:id="rId83">
+            <w:hyperlink r:id="rId84">
               <w:r>
                 <w:rPr>
                   <w:rStyle w:val="Hyperlink"/>
@@ -8224,7 +8573,7 @@
             <w:r>
               <w:t xml:space="preserve"> </w:t>
             </w:r>
-            <w:hyperlink r:id="rId84">
+            <w:hyperlink r:id="rId85">
               <w:r>
                 <w:rPr>
                   <w:rStyle w:val="Hyperlink"/>
@@ -8301,7 +8650,7 @@
             <w:r>
               <w:t xml:space="preserve"> </w:t>
             </w:r>
-            <w:hyperlink r:id="rId85">
+            <w:hyperlink r:id="rId86">
               <w:r>
                 <w:rPr>
                   <w:rStyle w:val="Hyperlink"/>
@@ -8332,7 +8681,7 @@
               <w:pStyle w:val="Compact"/>
               <w:jc w:val="left"/>
             </w:pPr>
-            <w:hyperlink r:id="rId86">
+            <w:hyperlink r:id="rId87">
               <w:r>
                 <w:rPr>
                   <w:rStyle w:val="Hyperlink"/>
@@ -8366,7 +8715,7 @@
               <w:pStyle w:val="Compact"/>
               <w:jc w:val="left"/>
             </w:pPr>
-            <w:hyperlink r:id="rId87">
+            <w:hyperlink r:id="rId88">
               <w:r>
                 <w:rPr>
                   <w:rStyle w:val="Hyperlink"/>
@@ -8397,7 +8746,7 @@
               <w:pStyle w:val="Compact"/>
               <w:jc w:val="left"/>
             </w:pPr>
-            <w:hyperlink r:id="rId88">
+            <w:hyperlink r:id="rId89">
               <w:r>
                 <w:rPr>
                   <w:rStyle w:val="Hyperlink"/>
@@ -8414,7 +8763,7 @@
             <w:r>
               <w:t xml:space="preserve"> </w:t>
             </w:r>
-            <w:hyperlink r:id="rId89">
+            <w:hyperlink r:id="rId90">
               <w:r>
                 <w:rPr>
                   <w:rStyle w:val="Hyperlink"/>
@@ -8431,7 +8780,7 @@
             <w:r>
               <w:t xml:space="preserve"> </w:t>
             </w:r>
-            <w:hyperlink r:id="rId90">
+            <w:hyperlink r:id="rId91">
               <w:r>
                 <w:rPr>
                   <w:rStyle w:val="Hyperlink"/>
@@ -8443,8 +8792,8 @@
         </w:tc>
       </w:tr>
     </w:tbl>
-    <w:bookmarkEnd w:id="91"/>
-    <w:bookmarkStart w:id="108" w:name="life-help"/>
+    <w:bookmarkEnd w:id="92"/>
+    <w:bookmarkStart w:id="109" w:name="life-help"/>
     <w:p>
       <w:pPr>
         <w:pStyle w:val="Heading2"/>
@@ -8513,7 +8862,7 @@
               <w:pStyle w:val="Compact"/>
               <w:jc w:val="left"/>
             </w:pPr>
-            <w:hyperlink r:id="rId92">
+            <w:hyperlink r:id="rId93">
               <w:r>
                 <w:rPr>
                   <w:rStyle w:val="Hyperlink"/>
@@ -8530,7 +8879,7 @@
             <w:r>
               <w:t xml:space="preserve"> </w:t>
             </w:r>
-            <w:hyperlink r:id="rId93">
+            <w:hyperlink r:id="rId94">
               <w:r>
                 <w:rPr>
                   <w:rStyle w:val="Hyperlink"/>
@@ -8547,7 +8896,7 @@
             <w:r>
               <w:t xml:space="preserve"> </w:t>
             </w:r>
-            <w:hyperlink r:id="rId94">
+            <w:hyperlink r:id="rId95">
               <w:r>
                 <w:rPr>
                   <w:rStyle w:val="Hyperlink"/>
@@ -8578,7 +8927,7 @@
               <w:pStyle w:val="Compact"/>
               <w:jc w:val="left"/>
             </w:pPr>
-            <w:hyperlink r:id="rId95">
+            <w:hyperlink r:id="rId96">
               <w:r>
                 <w:rPr>
                   <w:rStyle w:val="Hyperlink"/>
@@ -8592,7 +8941,7 @@
             <w:r>
               <w:t xml:space="preserve">— monthly food boxes; contact Cath Busha, Dean of Student Engagement (</w:t>
             </w:r>
-            <w:hyperlink r:id="rId96">
+            <w:hyperlink r:id="rId97">
               <w:r>
                 <w:rPr>
                   <w:rStyle w:val="Hyperlink"/>
@@ -8626,7 +8975,7 @@
               <w:pStyle w:val="Compact"/>
               <w:jc w:val="left"/>
             </w:pPr>
-            <w:hyperlink r:id="rId69">
+            <w:hyperlink r:id="rId70">
               <w:r>
                 <w:rPr>
                   <w:rStyle w:val="Hyperlink"/>
@@ -8657,7 +9006,7 @@
               <w:pStyle w:val="Compact"/>
               <w:jc w:val="left"/>
             </w:pPr>
-            <w:hyperlink r:id="rId97">
+            <w:hyperlink r:id="rId98">
               <w:r>
                 <w:rPr>
                   <w:rStyle w:val="Hyperlink"/>
@@ -8694,7 +9043,7 @@
               <w:pStyle w:val="Compact"/>
               <w:jc w:val="left"/>
             </w:pPr>
-            <w:hyperlink r:id="rId98">
+            <w:hyperlink r:id="rId99">
               <w:r>
                 <w:rPr>
                   <w:rStyle w:val="Hyperlink"/>
@@ -8711,7 +9060,7 @@
             <w:r>
               <w:t xml:space="preserve"> </w:t>
             </w:r>
-            <w:hyperlink r:id="rId99">
+            <w:hyperlink r:id="rId100">
               <w:r>
                 <w:rPr>
                   <w:rStyle w:val="Hyperlink"/>
@@ -8742,7 +9091,7 @@
               <w:pStyle w:val="Compact"/>
               <w:jc w:val="left"/>
             </w:pPr>
-            <w:hyperlink r:id="rId100">
+            <w:hyperlink r:id="rId101">
               <w:r>
                 <w:rPr>
                   <w:rStyle w:val="Hyperlink"/>
@@ -8759,7 +9108,7 @@
             <w:r>
               <w:t xml:space="preserve"> </w:t>
             </w:r>
-            <w:hyperlink r:id="rId101">
+            <w:hyperlink r:id="rId102">
               <w:r>
                 <w:rPr>
                   <w:rStyle w:val="Hyperlink"/>
@@ -8790,7 +9139,7 @@
               <w:pStyle w:val="Compact"/>
               <w:jc w:val="left"/>
             </w:pPr>
-            <w:hyperlink r:id="rId102">
+            <w:hyperlink r:id="rId103">
               <w:r>
                 <w:rPr>
                   <w:rStyle w:val="Hyperlink"/>
@@ -8827,7 +9176,7 @@
               <w:pStyle w:val="Compact"/>
               <w:jc w:val="left"/>
             </w:pPr>
-            <w:hyperlink r:id="rId103">
+            <w:hyperlink r:id="rId104">
               <w:r>
                 <w:rPr>
                   <w:rStyle w:val="Hyperlink"/>
@@ -8844,7 +9193,7 @@
             <w:r>
               <w:t xml:space="preserve"> </w:t>
             </w:r>
-            <w:hyperlink r:id="rId104">
+            <w:hyperlink r:id="rId105">
               <w:r>
                 <w:rPr>
                   <w:rStyle w:val="Hyperlink"/>
@@ -8890,7 +9239,7 @@
       <w:r>
         <w:t xml:space="preserve"> </w:t>
       </w:r>
-      <w:hyperlink r:id="rId105">
+      <w:hyperlink r:id="rId106">
         <w:r>
           <w:rPr>
             <w:rStyle w:val="Hyperlink"/>
@@ -8904,7 +9253,7 @@
       <w:r>
         <w:t xml:space="preserve"> </w:t>
       </w:r>
-      <w:hyperlink r:id="rId106">
+      <w:hyperlink r:id="rId107">
         <w:r>
           <w:rPr>
             <w:rStyle w:val="Hyperlink"/>
@@ -8921,7 +9270,7 @@
       <w:r>
         <w:t xml:space="preserve"> </w:t>
       </w:r>
-      <w:hyperlink r:id="rId107">
+      <w:hyperlink r:id="rId108">
         <w:r>
           <w:rPr>
             <w:rStyle w:val="Hyperlink"/>
@@ -8940,9 +9289,9 @@
         </w:pict>
       </w:r>
     </w:p>
-    <w:bookmarkEnd w:id="108"/>
     <w:bookmarkEnd w:id="109"/>
-    <w:bookmarkStart w:id="110" w:name="one-last-thing"/>
+    <w:bookmarkEnd w:id="110"/>
+    <w:bookmarkStart w:id="111" w:name="one-last-thing"/>
     <w:p>
       <w:pPr>
         <w:pStyle w:val="Heading1"/>
@@ -8979,7 +9328,7 @@
         <w:t xml:space="preserve">— Bruce</w:t>
       </w:r>
     </w:p>
-    <w:bookmarkEnd w:id="110"/>
+    <w:bookmarkEnd w:id="111"/>
     <w:sectPr>
       <w:pgSz w:w="12240" w:h="15840"/>
       <w:pgMar w:top="1440" w:right="1440" w:bottom="1440" w:left="1440" w:header="720" w:footer="720" w:gutter="0"/>
@@ -9329,6 +9678,9 @@
     <w:abstractNumId w:val="991"/>
   </w:num>
   <w:num w:numId="1017">
+    <w:abstractNumId w:val="991"/>
+  </w:num>
+  <w:num w:numId="1018">
     <w:abstractNumId w:val="991"/>
   </w:num>
 </w:numbering>

</xml_diff>

<commit_message>
Number regular expressions as Module 9, and note Module 1 spans two weeks
Canvas modules run Module 0 (setup), Module 1 (Weeks 1-2), then one per
week, so the regex module is Module 9, not Module 8. Fixes three mentions
and says in the "how the course works" paragraph that Module 1 covers the
first two weeks.

Co-Authored-By: Claude Opus 5 <noreply@anthropic.com>
Claude-Session: https://claude.ai/code/session_01AQUjcoZfDqwWNpHjrqQTaA
</commit_message>
<xml_diff>
--- a/fall-2026/ctec121/CTEC_121_Syllabus_Fall_2026.docx
+++ b/fall-2026/ctec121/CTEC_121_Syllabus_Fall_2026.docx
@@ -1955,7 +1955,7 @@
         <w:pStyle w:val="BodyText"/>
       </w:pPr>
       <w:r>
-        <w:t xml:space="preserve">Each week you’ll work through a Canvas module: readings, videos, labs, a problem set, and a collaborative assignment. Most weeks also open with a short in-class quiz on the module you just finished — eight across the quarter, on the dates in the schedule. Modules open on Sundays, except Modules 0 and 1, which open on the first day of class.</w:t>
+        <w:t xml:space="preserve">Each week you’ll work through a Canvas module — Module 1 spans the first two weeks — with readings, videos, labs, a problem set, and a collaborative assignment. Most weeks also open with a short in-class quiz on the module you just finished — eight across the quarter, on the dates in the schedule. Modules open on Sundays, except Modules 0 and 1, which open on the first day of class.</w:t>
       </w:r>
     </w:p>
     <w:p>
@@ -3190,7 +3190,7 @@
           <w:bCs/>
           <w:b/>
         </w:rPr>
-        <w:t xml:space="preserve">Module 8 (regular expressions) has no quiz.</w:t>
+        <w:t xml:space="preserve">Module 9 (regular expressions) has no quiz.</w:t>
       </w:r>
       <w:r>
         <w:t xml:space="preserve"> </w:t>
@@ -5427,7 +5427,7 @@
         <w:t xml:space="preserve"> </w:t>
       </w:r>
       <w:r>
-        <w:t xml:space="preserve">Week 10 has only one class session; it’s the week of Thanksgiving, and the final exam is the Monday right after the break. Regular expressions land in that week on purpose — they’re well suited to focused practice with the documentation open, which is how you’ll use them in real work. Module 8’s work is due</w:t>
+        <w:t xml:space="preserve">Week 10 has only one class session; it’s the week of Thanksgiving, and the final exam is the Monday right after the break. Regular expressions land in that week on purpose — they’re well suited to focused practice with the documentation open, which is how you’ll use them in real work. Module 9’s work is due</w:t>
       </w:r>
       <w:r>
         <w:t xml:space="preserve"> </w:t>
@@ -6634,7 +6634,7 @@
         <w:t xml:space="preserve"> </w:t>
       </w:r>
       <w:r>
-        <w:t xml:space="preserve">for a lab or a problem set. Later in the quarter it will be shorter — a disclosure about Module 8 or the final project may get only a few days, because the work still has to be graded before the quarter closes.</w:t>
+        <w:t xml:space="preserve">for a lab or a problem set. Later in the quarter it will be shorter — a disclosure about Module 9 or the final project may get only a few days, because the work still has to be graded before the quarter closes.</w:t>
       </w:r>
     </w:p>
     <w:p>

</xml_diff>

<commit_message>
Add the Module 0 first-week deadline and drop policy
Module 0 (setup) is due Thursday, September 24, at 11:59 PM Pacific.
Under Clark's first-week policy, students who haven't finished it are
dropped on Friday, September 25. Module 0 is now the third item outside
the three-day window, so the "only take-home deadline without the
window" wording for the final project is replaced everywhere, and the
Weeks 1-2 schedule row shows the Thursday deadline. The handout line
was shortened to fit the one-page limit.

Co-Authored-By: Claude Opus 5 <noreply@anthropic.com>
Claude-Session: https://claude.ai/code/session_01AQUjcoZfDqwWNpHjrqQTaA
</commit_message>
<xml_diff>
--- a/fall-2026/ctec121/CTEC_121_Syllabus_Fall_2026.docx
+++ b/fall-2026/ctec121/CTEC_121_Syllabus_Fall_2026.docx
@@ -830,6 +830,22 @@
       </w:r>
       <w:r>
         <w:t xml:space="preserve">— it sets up your coding environment, Slack, and GitHub.</w:t>
+      </w:r>
+      <w:r>
+        <w:t xml:space="preserve"> </w:t>
+      </w:r>
+      <w:r>
+        <w:rPr>
+          <w:bCs/>
+          <w:b/>
+        </w:rPr>
+        <w:t xml:space="preserve">Finish it by Thursday, September 24, at 11:59 PM Pacific.</w:t>
+      </w:r>
+      <w:r>
+        <w:t xml:space="preserve"> </w:t>
+      </w:r>
+      <w:r>
+        <w:t xml:space="preserve">Under Clark’s first-week policy, anyone who hasn’t will be dropped from the course on Friday, September 25.</w:t>
       </w:r>
     </w:p>
     <w:p>
@@ -2984,7 +3000,7 @@
         <w:t xml:space="preserve">three more days — through Wednesday at 11:59 PM — at full credit</w:t>
       </w:r>
       <w:r>
-        <w:t xml:space="preserve">. Two things sit outside it: anything taken in class, and the final project.</w:t>
+        <w:t xml:space="preserve">. Three things sit outside it: Module 0 (due Thursday, September 24), anything taken in class, and the final project.</w:t>
       </w:r>
     </w:p>
     <w:bookmarkEnd w:id="39"/>
@@ -3418,7 +3434,7 @@
           <w:bCs/>
           <w:b/>
         </w:rPr>
-        <w:t xml:space="preserve">December 4 is firm — it’s the only take-home deadline without the three-day window.</w:t>
+        <w:t xml:space="preserve">December 4 is firm — like Module 0, it has no three-day window.</w:t>
       </w:r>
       <w:r>
         <w:t xml:space="preserve"> </w:t>
@@ -4305,13 +4321,39 @@
           <w:bCs/>
           <w:b/>
         </w:rPr>
-        <w:t xml:space="preserve">Two things sit outside the window.</w:t>
+        <w:t xml:space="preserve">Three things sit outside the window.</w:t>
       </w:r>
       <w:r>
         <w:t xml:space="preserve"> </w:t>
       </w:r>
       <w:r>
         <w:t xml:space="preserve">First,</w:t>
+      </w:r>
+      <w:r>
+        <w:t xml:space="preserve"> </w:t>
+      </w:r>
+      <w:r>
+        <w:rPr>
+          <w:bCs/>
+          <w:b/>
+        </w:rPr>
+        <w:t xml:space="preserve">Module 0</w:t>
+      </w:r>
+      <w:r>
+        <w:t xml:space="preserve">, due</w:t>
+      </w:r>
+      <w:r>
+        <w:t xml:space="preserve"> </w:t>
+      </w:r>
+      <w:r>
+        <w:rPr>
+          <w:bCs/>
+          <w:b/>
+        </w:rPr>
+        <w:t xml:space="preserve">Thursday, September 24, at 11:59 PM Pacific</w:t>
+      </w:r>
+      <w:r>
+        <w:t xml:space="preserve">: under Clark’s first-week policy, I drop anyone who hasn’t finished it on Friday, September 25. If something is in your way, message me on Slack before Thursday. Second,</w:t>
       </w:r>
       <w:r>
         <w:t xml:space="preserve"> </w:t>
@@ -4343,7 +4385,7 @@
         <w:t xml:space="preserve"> </w:t>
       </w:r>
       <w:r>
-        <w:t xml:space="preserve">the date. Second, the</w:t>
+        <w:t xml:space="preserve">the date. Third, the</w:t>
       </w:r>
       <w:r>
         <w:t xml:space="preserve"> </w:t>
@@ -4577,6 +4619,22 @@
                 <w:bCs/>
                 <w:b/>
               </w:rPr>
+              <w:t xml:space="preserve">Thursday, September 24</w:t>
+            </w:r>
+            <w:r>
+              <w:t xml:space="preserve"> </w:t>
+            </w:r>
+            <w:r>
+              <w:t xml:space="preserve">— Module 0, no window ·</w:t>
+            </w:r>
+            <w:r>
+              <w:t xml:space="preserve"> </w:t>
+            </w:r>
+            <w:r>
+              <w:rPr>
+                <w:bCs/>
+                <w:b/>
+              </w:rPr>
               <w:t xml:space="preserve">Sunday, October 4</w:t>
             </w:r>
             <w:r>
@@ -5313,7 +5371,7 @@
               <w:t xml:space="preserve"> </w:t>
             </w:r>
             <w:r>
-              <w:t xml:space="preserve">— Final project. Firm: the only take-home deadline without the window.</w:t>
+              <w:t xml:space="preserve">— Final project. Firm: no three-day window.</w:t>
             </w:r>
           </w:p>
         </w:tc>
@@ -5401,7 +5459,7 @@
         <w:t xml:space="preserve">Wednesday at 11:59 PM</w:t>
       </w:r>
       <w:r>
-        <w:t xml:space="preserve">. Quizzes, the midterm and the final exam are taken in class on the dates shown in the Topic column, so they aren’t part of that window — and neither is the final project.</w:t>
+        <w:t xml:space="preserve">. Quizzes, the midterm and the final exam are taken in class on the dates shown in the Topic column, so they aren’t part of that window — and neither are Module 0 and the final project.</w:t>
       </w:r>
     </w:p>
     <w:p>

</xml_diff>

<commit_message>
Name the real first-week modules instead of "Module 0"
Module 0 - Getting Started holds no assignments; the required first-week
work lives in First Things First and Setting Up Your Coding Environment.
The deadline and drop language now names those two modules, and the
GitHub row points at the setup module. Handout wording shortened to hold
one page.

Co-Authored-By: Claude Opus 5 <noreply@anthropic.com>
Claude-Session: https://claude.ai/code/session_01AQUjcoZfDqwWNpHjrqQTaA
</commit_message>
<xml_diff>
--- a/fall-2026/ctec121/CTEC_121_Syllabus_Fall_2026.docx
+++ b/fall-2026/ctec121/CTEC_121_Syllabus_Fall_2026.docx
@@ -813,39 +813,68 @@
         <w:pStyle w:val="Compact"/>
       </w:pPr>
       <w:r>
-        <w:t xml:space="preserve">Work through</w:t>
-      </w:r>
-      <w:r>
-        <w:t xml:space="preserve"> </w:t>
-      </w:r>
-      <w:r>
-        <w:rPr>
-          <w:bCs/>
-          <w:b/>
-        </w:rPr>
-        <w:t xml:space="preserve">Module 0</w:t>
-      </w:r>
-      <w:r>
-        <w:t xml:space="preserve"> </w:t>
-      </w:r>
-      <w:r>
-        <w:t xml:space="preserve">— it sets up your coding environment, Slack, and GitHub.</w:t>
-      </w:r>
-      <w:r>
-        <w:t xml:space="preserve"> </w:t>
-      </w:r>
-      <w:r>
-        <w:rPr>
-          <w:bCs/>
-          <w:b/>
-        </w:rPr>
-        <w:t xml:space="preserve">Finish it by Thursday, September 24, at 11:59 PM Pacific.</w:t>
-      </w:r>
-      <w:r>
-        <w:t xml:space="preserve"> </w:t>
-      </w:r>
-      <w:r>
-        <w:t xml:space="preserve">Under Clark’s first-week policy, anyone who hasn’t will be dropped from the course on Friday, September 25.</w:t>
+        <w:t xml:space="preserve">Complete the</w:t>
+      </w:r>
+      <w:r>
+        <w:t xml:space="preserve"> </w:t>
+      </w:r>
+      <w:r>
+        <w:rPr>
+          <w:bCs/>
+          <w:b/>
+        </w:rPr>
+        <w:t xml:space="preserve">first-week assignments</w:t>
+      </w:r>
+      <w:r>
+        <w:t xml:space="preserve"> </w:t>
+      </w:r>
+      <w:r>
+        <w:t xml:space="preserve">in two Canvas modules,</w:t>
+      </w:r>
+      <w:r>
+        <w:t xml:space="preserve"> </w:t>
+      </w:r>
+      <w:r>
+        <w:rPr>
+          <w:bCs/>
+          <w:b/>
+        </w:rPr>
+        <w:t xml:space="preserve">First Things First</w:t>
+      </w:r>
+      <w:r>
+        <w:t xml:space="preserve"> </w:t>
+      </w:r>
+      <w:r>
+        <w:t xml:space="preserve">and</w:t>
+      </w:r>
+      <w:r>
+        <w:t xml:space="preserve"> </w:t>
+      </w:r>
+      <w:r>
+        <w:rPr>
+          <w:bCs/>
+          <w:b/>
+        </w:rPr>
+        <w:t xml:space="preserve">Setting Up Your Coding Environment</w:t>
+      </w:r>
+      <w:r>
+        <w:t xml:space="preserve">. Each has its own due date;</w:t>
+      </w:r>
+      <w:r>
+        <w:t xml:space="preserve"> </w:t>
+      </w:r>
+      <w:r>
+        <w:rPr>
+          <w:bCs/>
+          <w:b/>
+        </w:rPr>
+        <w:t xml:space="preserve">the last is Thursday, September 24, at 11:59 PM Pacific.</w:t>
+      </w:r>
+      <w:r>
+        <w:t xml:space="preserve"> </w:t>
+      </w:r>
+      <w:r>
+        <w:t xml:space="preserve">Under Clark’s first-week policy, anyone who hasn’t finished them all will be dropped from the course on Friday, September 25.</w:t>
       </w:r>
     </w:p>
     <w:p>
@@ -2373,7 +2402,7 @@
               <w:jc w:val="left"/>
             </w:pPr>
             <w:r>
-              <w:t xml:space="preserve">Free — it’s how you sign into cs50.dev. Setup in Module 0; an existing account is fine.</w:t>
+              <w:t xml:space="preserve">Free — it’s how you sign into cs50.dev. Setup is in the Setting Up Your Coding Environment module; an existing account is fine.</w:t>
             </w:r>
           </w:p>
         </w:tc>
@@ -3000,7 +3029,7 @@
         <w:t xml:space="preserve">three more days — through Wednesday at 11:59 PM — at full credit</w:t>
       </w:r>
       <w:r>
-        <w:t xml:space="preserve">. Three things sit outside it: Module 0 (due Thursday, September 24), anything taken in class, and the final project.</w:t>
+        <w:t xml:space="preserve">. Three things sit outside it: the first-week assignments (all due by Thursday, September 24), anything taken in class, and the final project.</w:t>
       </w:r>
     </w:p>
     <w:bookmarkEnd w:id="39"/>
@@ -3434,7 +3463,7 @@
           <w:bCs/>
           <w:b/>
         </w:rPr>
-        <w:t xml:space="preserve">December 4 is firm — like Module 0, it has no three-day window.</w:t>
+        <w:t xml:space="preserve">December 4 is firm — like the first-week assignments, it has no three-day window.</w:t>
       </w:r>
       <w:r>
         <w:t xml:space="preserve"> </w:t>
@@ -4327,20 +4356,23 @@
         <w:t xml:space="preserve"> </w:t>
       </w:r>
       <w:r>
-        <w:t xml:space="preserve">First,</w:t>
-      </w:r>
-      <w:r>
-        <w:t xml:space="preserve"> </w:t>
-      </w:r>
-      <w:r>
-        <w:rPr>
-          <w:bCs/>
-          <w:b/>
-        </w:rPr>
-        <w:t xml:space="preserve">Module 0</w:t>
-      </w:r>
-      <w:r>
-        <w:t xml:space="preserve">, due</w:t>
+        <w:t xml:space="preserve">First, the</w:t>
+      </w:r>
+      <w:r>
+        <w:t xml:space="preserve"> </w:t>
+      </w:r>
+      <w:r>
+        <w:rPr>
+          <w:bCs/>
+          <w:b/>
+        </w:rPr>
+        <w:t xml:space="preserve">first-week assignments</w:t>
+      </w:r>
+      <w:r>
+        <w:t xml:space="preserve"> </w:t>
+      </w:r>
+      <w:r>
+        <w:t xml:space="preserve">in First Things First and Setting Up Your Coding Environment, all due by</w:t>
       </w:r>
       <w:r>
         <w:t xml:space="preserve"> </w:t>
@@ -4353,7 +4385,7 @@
         <w:t xml:space="preserve">Thursday, September 24, at 11:59 PM Pacific</w:t>
       </w:r>
       <w:r>
-        <w:t xml:space="preserve">: under Clark’s first-week policy, I drop anyone who hasn’t finished it on Friday, September 25. If something is in your way, message me on Slack before Thursday. Second,</w:t>
+        <w:t xml:space="preserve">: under Clark’s first-week policy, I drop anyone who hasn’t finished them on Friday, September 25. If something is in your way, message me on Slack before Thursday. Second,</w:t>
       </w:r>
       <w:r>
         <w:t xml:space="preserve"> </w:t>
@@ -4625,7 +4657,7 @@
               <w:t xml:space="preserve"> </w:t>
             </w:r>
             <w:r>
-              <w:t xml:space="preserve">— Module 0, no window ·</w:t>
+              <w:t xml:space="preserve">— First-week assignments, no window ·</w:t>
             </w:r>
             <w:r>
               <w:t xml:space="preserve"> </w:t>
@@ -5459,7 +5491,7 @@
         <w:t xml:space="preserve">Wednesday at 11:59 PM</w:t>
       </w:r>
       <w:r>
-        <w:t xml:space="preserve">. Quizzes, the midterm and the final exam are taken in class on the dates shown in the Topic column, so they aren’t part of that window — and neither are Module 0 and the final project.</w:t>
+        <w:t xml:space="preserve">. Quizzes, the midterm and the final exam are taken in class on the dates shown in the Topic column, so they aren’t part of that window — and neither are the first-week assignments and the final project.</w:t>
       </w:r>
     </w:p>
     <w:p>

</xml_diff>